<commit_message>
Date: 14 Apr 2026
</commit_message>
<xml_diff>
--- a/Assignment_SA2601010.docx
+++ b/Assignment_SA2601010.docx
@@ -96,7 +96,25 @@
           <w:szCs w:val="22"/>
           <w:lang w:val="en-US"/>
         </w:rPr>
-        <w:t>Call driver.getPageSource() method</w:t>
+        <w:t xml:space="preserve">Call </w:t>
+      </w:r>
+      <w:proofErr w:type="spellStart"/>
+      <w:r>
+        <w:rPr>
+          <w:sz w:val="24"/>
+          <w:szCs w:val="22"/>
+          <w:lang w:val="en-US"/>
+        </w:rPr>
+        <w:t>driver.getPageSource</w:t>
+      </w:r>
+      <w:proofErr w:type="spellEnd"/>
+      <w:r>
+        <w:rPr>
+          <w:sz w:val="24"/>
+          <w:szCs w:val="22"/>
+          <w:lang w:val="en-US"/>
+        </w:rPr>
+        <w:t>() method</w:t>
       </w:r>
     </w:p>
     <w:p>
@@ -374,27 +392,7 @@
           <w:szCs w:val="22"/>
           <w:lang w:val="en-US"/>
         </w:rPr>
-        <w:t xml:space="preserve">Use </w:t>
-      </w:r>
-      <w:r>
-        <w:rPr>
-          <w:b/>
-          <w:bCs/>
-          <w:sz w:val="24"/>
-          <w:szCs w:val="22"/>
-          <w:lang w:val="en-US"/>
-        </w:rPr>
-        <w:t>name</w:t>
-      </w:r>
-      <w:r>
-        <w:rPr>
-          <w:b/>
-          <w:bCs/>
-          <w:sz w:val="24"/>
-          <w:szCs w:val="22"/>
-          <w:lang w:val="en-US"/>
-        </w:rPr>
-        <w:t xml:space="preserve"> Locator</w:t>
+        <w:t>Use name Locator</w:t>
       </w:r>
     </w:p>
     <w:p>
@@ -546,29 +544,7 @@
           <w:highlight w:val="yellow"/>
           <w:lang w:val="en-US"/>
         </w:rPr>
-        <w:t xml:space="preserve">Use </w:t>
-      </w:r>
-      <w:r>
-        <w:rPr>
-          <w:b/>
-          <w:bCs/>
-          <w:sz w:val="24"/>
-          <w:szCs w:val="22"/>
-          <w:highlight w:val="yellow"/>
-          <w:lang w:val="en-US"/>
-        </w:rPr>
-        <w:t>ClassName</w:t>
-      </w:r>
-      <w:r>
-        <w:rPr>
-          <w:b/>
-          <w:bCs/>
-          <w:sz w:val="24"/>
-          <w:szCs w:val="22"/>
-          <w:highlight w:val="yellow"/>
-          <w:lang w:val="en-US"/>
-        </w:rPr>
-        <w:t xml:space="preserve"> Locator</w:t>
+        <w:t>Use ClassName Locator</w:t>
       </w:r>
     </w:p>
     <w:p>
@@ -590,10 +566,10 @@
           <w:szCs w:val="22"/>
           <w:lang w:val="en-US"/>
         </w:rPr>
-        <w:t>Launc</w:t>
-      </w:r>
-      <w:r>
-        <w:t xml:space="preserve">h </w:t>
+        <w:t>Launch</w:t>
+      </w:r>
+      <w:r>
+        <w:t xml:space="preserve"> </w:t>
       </w:r>
       <w:hyperlink r:id="rId9" w:history="1">
         <w:r>
@@ -732,6 +708,493 @@
         </w:rPr>
         <w:t>e</w:t>
       </w:r>
+      <w:r>
+        <w:rPr>
+          <w:sz w:val="24"/>
+          <w:szCs w:val="22"/>
+          <w:lang w:val="en-US"/>
+        </w:rPr>
+        <w:t>ned.</w:t>
+      </w:r>
+      <w:r>
+        <w:rPr>
+          <w:sz w:val="24"/>
+          <w:szCs w:val="22"/>
+          <w:lang w:val="en-US"/>
+        </w:rPr>
+        <w:br/>
+      </w:r>
+    </w:p>
+    <w:p>
+      <w:pPr>
+        <w:rPr>
+          <w:sz w:val="24"/>
+          <w:szCs w:val="22"/>
+          <w:lang w:val="en-US"/>
+        </w:rPr>
+      </w:pPr>
+    </w:p>
+    <w:p>
+      <w:pPr>
+        <w:rPr>
+          <w:sz w:val="24"/>
+          <w:szCs w:val="22"/>
+          <w:lang w:val="en-US"/>
+        </w:rPr>
+      </w:pPr>
+      <w:r>
+        <w:rPr>
+          <w:sz w:val="24"/>
+          <w:szCs w:val="22"/>
+          <w:lang w:val="en-US"/>
+        </w:rPr>
+        <w:t>Date: 14 April 2025</w:t>
+      </w:r>
+    </w:p>
+    <w:p>
+      <w:pPr>
+        <w:rPr>
+          <w:sz w:val="24"/>
+          <w:szCs w:val="22"/>
+          <w:lang w:val="en-US"/>
+        </w:rPr>
+      </w:pPr>
+    </w:p>
+    <w:p>
+      <w:pPr>
+        <w:pStyle w:val="ListParagraph"/>
+        <w:numPr>
+          <w:ilvl w:val="0"/>
+          <w:numId w:val="1"/>
+        </w:numPr>
+        <w:rPr>
+          <w:sz w:val="24"/>
+          <w:szCs w:val="22"/>
+          <w:lang w:val="en-US"/>
+        </w:rPr>
+      </w:pPr>
+      <w:r>
+        <w:rPr>
+          <w:sz w:val="24"/>
+          <w:szCs w:val="22"/>
+          <w:lang w:val="en-US"/>
+        </w:rPr>
+        <w:t xml:space="preserve">Launch </w:t>
+      </w:r>
+      <w:hyperlink r:id="rId11" w:history="1">
+        <w:r>
+          <w:rPr>
+            <w:rStyle w:val="Hyperlink"/>
+            <w:sz w:val="24"/>
+            <w:szCs w:val="22"/>
+            <w:lang w:val="en-US"/>
+          </w:rPr>
+          <w:t>https://practicetestautomation.com/practice-test-login/</w:t>
+        </w:r>
+      </w:hyperlink>
+    </w:p>
+    <w:p>
+      <w:pPr>
+        <w:pStyle w:val="ListParagraph"/>
+        <w:numPr>
+          <w:ilvl w:val="1"/>
+          <w:numId w:val="1"/>
+        </w:numPr>
+        <w:rPr>
+          <w:sz w:val="24"/>
+          <w:szCs w:val="22"/>
+          <w:lang w:val="en-US"/>
+        </w:rPr>
+      </w:pPr>
+      <w:r>
+        <w:rPr>
+          <w:sz w:val="24"/>
+          <w:szCs w:val="22"/>
+          <w:lang w:val="en-US"/>
+        </w:rPr>
+        <w:t>Enter valid user name</w:t>
+      </w:r>
+    </w:p>
+    <w:p>
+      <w:pPr>
+        <w:pStyle w:val="ListParagraph"/>
+        <w:numPr>
+          <w:ilvl w:val="1"/>
+          <w:numId w:val="1"/>
+        </w:numPr>
+        <w:rPr>
+          <w:sz w:val="24"/>
+          <w:szCs w:val="22"/>
+          <w:lang w:val="en-US"/>
+        </w:rPr>
+      </w:pPr>
+      <w:r>
+        <w:rPr>
+          <w:sz w:val="24"/>
+          <w:szCs w:val="22"/>
+          <w:lang w:val="en-US"/>
+        </w:rPr>
+        <w:t>Enter valid password</w:t>
+      </w:r>
+    </w:p>
+    <w:p>
+      <w:pPr>
+        <w:pStyle w:val="ListParagraph"/>
+        <w:numPr>
+          <w:ilvl w:val="1"/>
+          <w:numId w:val="1"/>
+        </w:numPr>
+        <w:rPr>
+          <w:sz w:val="24"/>
+          <w:szCs w:val="22"/>
+          <w:lang w:val="en-US"/>
+        </w:rPr>
+      </w:pPr>
+      <w:r>
+        <w:rPr>
+          <w:sz w:val="24"/>
+          <w:szCs w:val="22"/>
+          <w:lang w:val="en-US"/>
+        </w:rPr>
+        <w:t>Click on Login button</w:t>
+      </w:r>
+    </w:p>
+    <w:p>
+      <w:pPr>
+        <w:pStyle w:val="ListParagraph"/>
+        <w:numPr>
+          <w:ilvl w:val="1"/>
+          <w:numId w:val="1"/>
+        </w:numPr>
+        <w:rPr>
+          <w:sz w:val="24"/>
+          <w:szCs w:val="22"/>
+          <w:lang w:val="en-US"/>
+        </w:rPr>
+      </w:pPr>
+      <w:r>
+        <w:rPr>
+          <w:sz w:val="24"/>
+          <w:szCs w:val="22"/>
+          <w:lang w:val="en-US"/>
+        </w:rPr>
+        <w:t>If login is successful then click on Logout link</w:t>
+      </w:r>
+      <w:r>
+        <w:rPr>
+          <w:sz w:val="24"/>
+          <w:szCs w:val="22"/>
+          <w:lang w:val="en-US"/>
+        </w:rPr>
+        <w:br/>
+      </w:r>
+      <w:r>
+        <w:rPr>
+          <w:b/>
+          <w:bCs/>
+          <w:sz w:val="24"/>
+          <w:szCs w:val="22"/>
+          <w:lang w:val="en-US"/>
+        </w:rPr>
+        <w:t>Use CssSelector except link.</w:t>
+      </w:r>
+    </w:p>
+    <w:p>
+      <w:pPr>
+        <w:pStyle w:val="ListParagraph"/>
+        <w:numPr>
+          <w:ilvl w:val="0"/>
+          <w:numId w:val="1"/>
+        </w:numPr>
+        <w:rPr>
+          <w:sz w:val="24"/>
+          <w:szCs w:val="22"/>
+          <w:lang w:val="en-US"/>
+        </w:rPr>
+      </w:pPr>
+      <w:r>
+        <w:rPr>
+          <w:sz w:val="24"/>
+          <w:szCs w:val="22"/>
+          <w:lang w:val="en-US"/>
+        </w:rPr>
+        <w:t xml:space="preserve">Launch </w:t>
+      </w:r>
+      <w:hyperlink r:id="rId12" w:history="1">
+        <w:r>
+          <w:rPr>
+            <w:rStyle w:val="Hyperlink"/>
+            <w:sz w:val="24"/>
+            <w:szCs w:val="22"/>
+            <w:lang w:val="en-US"/>
+          </w:rPr>
+          <w:t>https://register.rediff.com/register/register.php?FormName=user_details</w:t>
+        </w:r>
+      </w:hyperlink>
+    </w:p>
+    <w:p>
+      <w:pPr>
+        <w:pStyle w:val="ListParagraph"/>
+        <w:numPr>
+          <w:ilvl w:val="1"/>
+          <w:numId w:val="1"/>
+        </w:numPr>
+        <w:rPr>
+          <w:sz w:val="24"/>
+          <w:szCs w:val="22"/>
+          <w:lang w:val="en-US"/>
+        </w:rPr>
+      </w:pPr>
+      <w:r>
+        <w:rPr>
+          <w:sz w:val="24"/>
+          <w:szCs w:val="22"/>
+          <w:lang w:val="en-US"/>
+        </w:rPr>
+        <w:t>Enter full name</w:t>
+      </w:r>
+    </w:p>
+    <w:p>
+      <w:pPr>
+        <w:pStyle w:val="ListParagraph"/>
+        <w:numPr>
+          <w:ilvl w:val="1"/>
+          <w:numId w:val="1"/>
+        </w:numPr>
+        <w:rPr>
+          <w:sz w:val="24"/>
+          <w:szCs w:val="22"/>
+          <w:lang w:val="en-US"/>
+        </w:rPr>
+      </w:pPr>
+      <w:r>
+        <w:rPr>
+          <w:sz w:val="24"/>
+          <w:szCs w:val="22"/>
+          <w:lang w:val="en-US"/>
+        </w:rPr>
+        <w:t>Enter Rediff id</w:t>
+      </w:r>
+    </w:p>
+    <w:p>
+      <w:pPr>
+        <w:pStyle w:val="ListParagraph"/>
+        <w:numPr>
+          <w:ilvl w:val="1"/>
+          <w:numId w:val="1"/>
+        </w:numPr>
+        <w:rPr>
+          <w:sz w:val="24"/>
+          <w:szCs w:val="22"/>
+          <w:lang w:val="en-US"/>
+        </w:rPr>
+      </w:pPr>
+      <w:r>
+        <w:rPr>
+          <w:sz w:val="24"/>
+          <w:szCs w:val="22"/>
+          <w:lang w:val="en-US"/>
+        </w:rPr>
+        <w:lastRenderedPageBreak/>
+        <w:t>Enter password</w:t>
+      </w:r>
+    </w:p>
+    <w:p>
+      <w:pPr>
+        <w:pStyle w:val="ListParagraph"/>
+        <w:numPr>
+          <w:ilvl w:val="1"/>
+          <w:numId w:val="1"/>
+        </w:numPr>
+        <w:rPr>
+          <w:sz w:val="24"/>
+          <w:szCs w:val="22"/>
+          <w:lang w:val="en-US"/>
+        </w:rPr>
+      </w:pPr>
+      <w:r>
+        <w:rPr>
+          <w:sz w:val="24"/>
+          <w:szCs w:val="22"/>
+          <w:lang w:val="en-US"/>
+        </w:rPr>
+        <w:t>Enter confirm password</w:t>
+      </w:r>
+    </w:p>
+    <w:p>
+      <w:pPr>
+        <w:pStyle w:val="ListParagraph"/>
+        <w:numPr>
+          <w:ilvl w:val="1"/>
+          <w:numId w:val="1"/>
+        </w:numPr>
+        <w:rPr>
+          <w:sz w:val="24"/>
+          <w:szCs w:val="22"/>
+          <w:lang w:val="en-US"/>
+        </w:rPr>
+      </w:pPr>
+      <w:r>
+        <w:rPr>
+          <w:sz w:val="24"/>
+          <w:szCs w:val="22"/>
+          <w:lang w:val="en-US"/>
+        </w:rPr>
+        <w:t>Enter recovery email</w:t>
+      </w:r>
+    </w:p>
+    <w:p>
+      <w:pPr>
+        <w:pStyle w:val="ListParagraph"/>
+        <w:numPr>
+          <w:ilvl w:val="1"/>
+          <w:numId w:val="1"/>
+        </w:numPr>
+        <w:rPr>
+          <w:sz w:val="24"/>
+          <w:szCs w:val="22"/>
+          <w:lang w:val="en-US"/>
+        </w:rPr>
+      </w:pPr>
+      <w:r>
+        <w:rPr>
+          <w:sz w:val="24"/>
+          <w:szCs w:val="22"/>
+          <w:lang w:val="en-US"/>
+        </w:rPr>
+        <w:t>Enter mobile number</w:t>
+      </w:r>
+      <w:r>
+        <w:rPr>
+          <w:sz w:val="24"/>
+          <w:szCs w:val="22"/>
+          <w:lang w:val="en-US"/>
+        </w:rPr>
+        <w:br/>
+      </w:r>
+      <w:r>
+        <w:rPr>
+          <w:b/>
+          <w:bCs/>
+          <w:sz w:val="24"/>
+          <w:szCs w:val="22"/>
+          <w:lang w:val="en-US"/>
+        </w:rPr>
+        <w:t>Use Absolute XPath</w:t>
+      </w:r>
+    </w:p>
+    <w:p>
+      <w:pPr>
+        <w:pStyle w:val="ListParagraph"/>
+        <w:numPr>
+          <w:ilvl w:val="0"/>
+          <w:numId w:val="1"/>
+        </w:numPr>
+        <w:rPr>
+          <w:sz w:val="24"/>
+          <w:szCs w:val="22"/>
+          <w:lang w:val="en-US"/>
+        </w:rPr>
+      </w:pPr>
+      <w:r>
+        <w:rPr>
+          <w:sz w:val="24"/>
+          <w:szCs w:val="22"/>
+          <w:lang w:val="en-US"/>
+        </w:rPr>
+        <w:t xml:space="preserve">Launch </w:t>
+      </w:r>
+      <w:hyperlink r:id="rId13" w:history="1">
+        <w:r>
+          <w:rPr>
+            <w:rStyle w:val="Hyperlink"/>
+            <w:sz w:val="24"/>
+            <w:szCs w:val="22"/>
+            <w:lang w:val="en-US"/>
+          </w:rPr>
+          <w:t>https://www.echotrak.com/Login.aspx?ReturnUrl=%2f</w:t>
+        </w:r>
+      </w:hyperlink>
+    </w:p>
+    <w:p>
+      <w:pPr>
+        <w:pStyle w:val="ListParagraph"/>
+        <w:numPr>
+          <w:ilvl w:val="1"/>
+          <w:numId w:val="1"/>
+        </w:numPr>
+        <w:rPr>
+          <w:sz w:val="24"/>
+          <w:szCs w:val="22"/>
+          <w:lang w:val="en-US"/>
+        </w:rPr>
+      </w:pPr>
+      <w:r>
+        <w:rPr>
+          <w:sz w:val="24"/>
+          <w:szCs w:val="22"/>
+          <w:lang w:val="en-US"/>
+        </w:rPr>
+        <w:t>Enter user name as your name</w:t>
+      </w:r>
+    </w:p>
+    <w:p>
+      <w:pPr>
+        <w:pStyle w:val="ListParagraph"/>
+        <w:numPr>
+          <w:ilvl w:val="1"/>
+          <w:numId w:val="1"/>
+        </w:numPr>
+        <w:rPr>
+          <w:sz w:val="24"/>
+          <w:szCs w:val="22"/>
+          <w:lang w:val="en-US"/>
+        </w:rPr>
+      </w:pPr>
+      <w:r>
+        <w:rPr>
+          <w:sz w:val="24"/>
+          <w:szCs w:val="22"/>
+          <w:lang w:val="en-US"/>
+        </w:rPr>
+        <w:t>Enter password as your name</w:t>
+      </w:r>
+    </w:p>
+    <w:p>
+      <w:pPr>
+        <w:pStyle w:val="ListParagraph"/>
+        <w:numPr>
+          <w:ilvl w:val="1"/>
+          <w:numId w:val="1"/>
+        </w:numPr>
+        <w:rPr>
+          <w:sz w:val="24"/>
+          <w:szCs w:val="22"/>
+          <w:lang w:val="en-US"/>
+        </w:rPr>
+      </w:pPr>
+      <w:r>
+        <w:rPr>
+          <w:sz w:val="24"/>
+          <w:szCs w:val="22"/>
+          <w:lang w:val="en-US"/>
+        </w:rPr>
+        <w:t>Click on login button</w:t>
+      </w:r>
+    </w:p>
+    <w:p>
+      <w:pPr>
+        <w:pStyle w:val="ListParagraph"/>
+        <w:numPr>
+          <w:ilvl w:val="1"/>
+          <w:numId w:val="1"/>
+        </w:numPr>
+        <w:rPr>
+          <w:sz w:val="24"/>
+          <w:szCs w:val="22"/>
+          <w:lang w:val="en-US"/>
+        </w:rPr>
+      </w:pPr>
       <w:bookmarkStart w:id="0" w:name="_GoBack"/>
       <w:bookmarkEnd w:id="0"/>
       <w:r>
@@ -740,8 +1203,191 @@
           <w:szCs w:val="22"/>
           <w:lang w:val="en-US"/>
         </w:rPr>
-        <w:t>ned.</w:t>
-      </w:r>
+        <w:t>Display error message and verify the output</w:t>
+      </w:r>
+      <w:r>
+        <w:rPr>
+          <w:sz w:val="24"/>
+          <w:szCs w:val="22"/>
+          <w:lang w:val="en-US"/>
+        </w:rPr>
+        <w:br/>
+      </w:r>
+      <w:r>
+        <w:rPr>
+          <w:b/>
+          <w:bCs/>
+          <w:sz w:val="24"/>
+          <w:szCs w:val="22"/>
+          <w:lang w:val="en-US"/>
+        </w:rPr>
+        <w:t>Use ClassName Locator</w:t>
+      </w:r>
+    </w:p>
+    <w:p>
+      <w:pPr>
+        <w:pStyle w:val="ListParagraph"/>
+        <w:numPr>
+          <w:ilvl w:val="0"/>
+          <w:numId w:val="1"/>
+        </w:numPr>
+        <w:rPr>
+          <w:sz w:val="24"/>
+          <w:szCs w:val="22"/>
+          <w:highlight w:val="yellow"/>
+          <w:lang w:val="en-US"/>
+        </w:rPr>
+      </w:pPr>
+      <w:r>
+        <w:rPr>
+          <w:sz w:val="24"/>
+          <w:szCs w:val="22"/>
+          <w:highlight w:val="yellow"/>
+          <w:lang w:val="en-US"/>
+        </w:rPr>
+        <w:t xml:space="preserve">Launch </w:t>
+      </w:r>
+      <w:hyperlink r:id="rId14" w:history="1">
+        <w:r>
+          <w:rPr>
+            <w:rStyle w:val="Hyperlink"/>
+            <w:sz w:val="24"/>
+            <w:szCs w:val="22"/>
+            <w:highlight w:val="yellow"/>
+            <w:lang w:val="en-US"/>
+          </w:rPr>
+          <w:t>https://opensource-demo.orangehrmlive.com/web/index.php/auth/login</w:t>
+        </w:r>
+      </w:hyperlink>
+    </w:p>
+    <w:p>
+      <w:pPr>
+        <w:pStyle w:val="ListParagraph"/>
+        <w:numPr>
+          <w:ilvl w:val="1"/>
+          <w:numId w:val="1"/>
+        </w:numPr>
+        <w:rPr>
+          <w:sz w:val="24"/>
+          <w:szCs w:val="22"/>
+          <w:highlight w:val="yellow"/>
+          <w:lang w:val="en-US"/>
+        </w:rPr>
+      </w:pPr>
+      <w:r>
+        <w:rPr>
+          <w:sz w:val="24"/>
+          <w:szCs w:val="22"/>
+          <w:highlight w:val="yellow"/>
+          <w:lang w:val="en-US"/>
+        </w:rPr>
+        <w:t>Enter user name as admin</w:t>
+      </w:r>
+    </w:p>
+    <w:p>
+      <w:pPr>
+        <w:pStyle w:val="ListParagraph"/>
+        <w:numPr>
+          <w:ilvl w:val="1"/>
+          <w:numId w:val="1"/>
+        </w:numPr>
+        <w:rPr>
+          <w:sz w:val="24"/>
+          <w:szCs w:val="22"/>
+          <w:highlight w:val="yellow"/>
+          <w:lang w:val="en-US"/>
+        </w:rPr>
+      </w:pPr>
+      <w:r>
+        <w:rPr>
+          <w:sz w:val="24"/>
+          <w:szCs w:val="22"/>
+          <w:highlight w:val="yellow"/>
+          <w:lang w:val="en-US"/>
+        </w:rPr>
+        <w:t>Enter password as admin123</w:t>
+      </w:r>
+    </w:p>
+    <w:p>
+      <w:pPr>
+        <w:pStyle w:val="ListParagraph"/>
+        <w:numPr>
+          <w:ilvl w:val="1"/>
+          <w:numId w:val="1"/>
+        </w:numPr>
+        <w:rPr>
+          <w:sz w:val="24"/>
+          <w:szCs w:val="22"/>
+          <w:highlight w:val="yellow"/>
+          <w:lang w:val="en-US"/>
+        </w:rPr>
+      </w:pPr>
+      <w:r>
+        <w:rPr>
+          <w:sz w:val="24"/>
+          <w:szCs w:val="22"/>
+          <w:highlight w:val="yellow"/>
+          <w:lang w:val="en-US"/>
+        </w:rPr>
+        <w:t>Click on Login button</w:t>
+      </w:r>
+    </w:p>
+    <w:p>
+      <w:pPr>
+        <w:pStyle w:val="ListParagraph"/>
+        <w:numPr>
+          <w:ilvl w:val="1"/>
+          <w:numId w:val="1"/>
+        </w:numPr>
+        <w:rPr>
+          <w:sz w:val="24"/>
+          <w:szCs w:val="22"/>
+          <w:highlight w:val="yellow"/>
+          <w:lang w:val="en-US"/>
+        </w:rPr>
+      </w:pPr>
+      <w:r>
+        <w:rPr>
+          <w:sz w:val="24"/>
+          <w:szCs w:val="22"/>
+          <w:highlight w:val="yellow"/>
+          <w:lang w:val="en-US"/>
+        </w:rPr>
+        <w:t>Logout if login is successful</w:t>
+      </w:r>
+      <w:r>
+        <w:rPr>
+          <w:sz w:val="24"/>
+          <w:szCs w:val="22"/>
+          <w:lang w:val="en-US"/>
+        </w:rPr>
+        <w:br/>
+      </w:r>
+      <w:r>
+        <w:rPr>
+          <w:b/>
+          <w:bCs/>
+          <w:sz w:val="24"/>
+          <w:szCs w:val="22"/>
+          <w:highlight w:val="yellow"/>
+          <w:lang w:val="en-US"/>
+        </w:rPr>
+        <w:t xml:space="preserve">Use any locator </w:t>
+      </w:r>
+    </w:p>
+    <w:p>
+      <w:pPr>
+        <w:pStyle w:val="ListParagraph"/>
+        <w:numPr>
+          <w:ilvl w:val="0"/>
+          <w:numId w:val="1"/>
+        </w:numPr>
+        <w:rPr>
+          <w:sz w:val="24"/>
+          <w:szCs w:val="22"/>
+          <w:lang w:val="en-US"/>
+        </w:rPr>
+      </w:pPr>
     </w:p>
     <w:sectPr>
       <w:pgSz w:w="11906" w:h="16838"/>
@@ -1246,6 +1892,7 @@
   <w:style w:type="character" w:default="1" w:styleId="DefaultParagraphFont">
     <w:name w:val="Default Paragraph Font"/>
     <w:uiPriority w:val="1"/>
+    <w:semiHidden/>
     <w:unhideWhenUsed/>
   </w:style>
   <w:style w:type="table" w:default="1" w:styleId="TableNormal">

</xml_diff>

<commit_message>
Date: 15 Apr 2026
</commit_message>
<xml_diff>
--- a/Assignment_SA2601010.docx
+++ b/Assignment_SA2601010.docx
@@ -1195,8 +1195,6 @@
           <w:lang w:val="en-US"/>
         </w:rPr>
       </w:pPr>
-      <w:bookmarkStart w:id="0" w:name="_GoBack"/>
-      <w:bookmarkEnd w:id="0"/>
       <w:r>
         <w:rPr>
           <w:sz w:val="24"/>
@@ -1377,6 +1375,51 @@
     </w:p>
     <w:p>
       <w:pPr>
+        <w:rPr>
+          <w:sz w:val="24"/>
+          <w:szCs w:val="22"/>
+          <w:highlight w:val="yellow"/>
+          <w:lang w:val="en-US"/>
+        </w:rPr>
+      </w:pPr>
+    </w:p>
+    <w:p>
+      <w:pPr>
+        <w:rPr>
+          <w:sz w:val="24"/>
+          <w:szCs w:val="22"/>
+          <w:lang w:val="en-US"/>
+        </w:rPr>
+      </w:pPr>
+      <w:r>
+        <w:rPr>
+          <w:sz w:val="24"/>
+          <w:szCs w:val="22"/>
+          <w:lang w:val="en-US"/>
+        </w:rPr>
+        <w:t>Date</w:t>
+      </w:r>
+      <w:r>
+        <w:rPr>
+          <w:sz w:val="24"/>
+          <w:szCs w:val="22"/>
+          <w:lang w:val="en-US"/>
+        </w:rPr>
+        <w:t>: 15 April 2026</w:t>
+      </w:r>
+    </w:p>
+    <w:p>
+      <w:pPr>
+        <w:rPr>
+          <w:sz w:val="24"/>
+          <w:szCs w:val="22"/>
+          <w:highlight w:val="yellow"/>
+          <w:lang w:val="en-US"/>
+        </w:rPr>
+      </w:pPr>
+    </w:p>
+    <w:p>
+      <w:pPr>
         <w:pStyle w:val="ListParagraph"/>
         <w:numPr>
           <w:ilvl w:val="0"/>
@@ -1388,6 +1431,269 @@
           <w:lang w:val="en-US"/>
         </w:rPr>
       </w:pPr>
+      <w:r>
+        <w:rPr>
+          <w:sz w:val="24"/>
+          <w:szCs w:val="22"/>
+          <w:lang w:val="en-US"/>
+        </w:rPr>
+        <w:t>Launch</w:t>
+      </w:r>
+      <w:r>
+        <w:rPr>
+          <w:sz w:val="24"/>
+          <w:szCs w:val="22"/>
+          <w:lang w:val="en-US"/>
+        </w:rPr>
+        <w:t xml:space="preserve"> </w:t>
+      </w:r>
+      <w:hyperlink r:id="rId15" w:history="1">
+        <w:r>
+          <w:rPr>
+            <w:rStyle w:val="Hyperlink"/>
+            <w:sz w:val="24"/>
+            <w:szCs w:val="22"/>
+            <w:lang w:val="en-US"/>
+          </w:rPr>
+          <w:t>https://echoecho.com/htmlforms09.htm</w:t>
+        </w:r>
+      </w:hyperlink>
+    </w:p>
+    <w:p>
+      <w:pPr>
+        <w:pStyle w:val="ListParagraph"/>
+        <w:numPr>
+          <w:ilvl w:val="1"/>
+          <w:numId w:val="1"/>
+        </w:numPr>
+        <w:rPr>
+          <w:sz w:val="24"/>
+          <w:szCs w:val="22"/>
+          <w:lang w:val="en-US"/>
+        </w:rPr>
+      </w:pPr>
+      <w:r>
+        <w:rPr>
+          <w:sz w:val="24"/>
+          <w:szCs w:val="22"/>
+          <w:lang w:val="en-US"/>
+        </w:rPr>
+        <w:t>Display status of all 3 checkboxes (Visible, Selected, Enabled)</w:t>
+      </w:r>
+    </w:p>
+    <w:p>
+      <w:pPr>
+        <w:pStyle w:val="ListParagraph"/>
+        <w:numPr>
+          <w:ilvl w:val="1"/>
+          <w:numId w:val="1"/>
+        </w:numPr>
+        <w:rPr>
+          <w:sz w:val="24"/>
+          <w:szCs w:val="22"/>
+          <w:lang w:val="en-US"/>
+        </w:rPr>
+      </w:pPr>
+      <w:r>
+        <w:rPr>
+          <w:sz w:val="24"/>
+          <w:szCs w:val="22"/>
+          <w:lang w:val="en-US"/>
+        </w:rPr>
+        <w:t>Select only those checkboxes those are not selected</w:t>
+      </w:r>
+    </w:p>
+    <w:p>
+      <w:pPr>
+        <w:pStyle w:val="ListParagraph"/>
+        <w:numPr>
+          <w:ilvl w:val="1"/>
+          <w:numId w:val="1"/>
+        </w:numPr>
+        <w:rPr>
+          <w:sz w:val="24"/>
+          <w:szCs w:val="22"/>
+          <w:lang w:val="en-US"/>
+        </w:rPr>
+      </w:pPr>
+      <w:r>
+        <w:rPr>
+          <w:sz w:val="24"/>
+          <w:szCs w:val="22"/>
+          <w:lang w:val="en-US"/>
+        </w:rPr>
+        <w:t>Display status of all 3 checkboxes (Visible, Selected, Enabled)</w:t>
+      </w:r>
+    </w:p>
+    <w:p>
+      <w:pPr>
+        <w:pStyle w:val="ListParagraph"/>
+        <w:numPr>
+          <w:ilvl w:val="0"/>
+          <w:numId w:val="1"/>
+        </w:numPr>
+        <w:rPr>
+          <w:sz w:val="24"/>
+          <w:szCs w:val="22"/>
+          <w:lang w:val="en-US"/>
+        </w:rPr>
+      </w:pPr>
+      <w:r>
+        <w:rPr>
+          <w:sz w:val="24"/>
+          <w:szCs w:val="22"/>
+          <w:lang w:val="en-US"/>
+        </w:rPr>
+        <w:t xml:space="preserve">Launch </w:t>
+      </w:r>
+      <w:hyperlink r:id="rId16" w:history="1">
+        <w:r>
+          <w:rPr>
+            <w:rStyle w:val="Hyperlink"/>
+            <w:sz w:val="24"/>
+            <w:szCs w:val="22"/>
+            <w:lang w:val="en-US"/>
+          </w:rPr>
+          <w:t>https://testautomationpractice.blogspot.com/?m=1</w:t>
+        </w:r>
+      </w:hyperlink>
+    </w:p>
+    <w:p>
+      <w:pPr>
+        <w:pStyle w:val="ListParagraph"/>
+        <w:numPr>
+          <w:ilvl w:val="1"/>
+          <w:numId w:val="1"/>
+        </w:numPr>
+        <w:rPr>
+          <w:sz w:val="24"/>
+          <w:szCs w:val="22"/>
+          <w:lang w:val="en-US"/>
+        </w:rPr>
+      </w:pPr>
+      <w:r>
+        <w:rPr>
+          <w:sz w:val="24"/>
+          <w:szCs w:val="22"/>
+          <w:lang w:val="en-US"/>
+        </w:rPr>
+        <w:t>Select all 7 checkboxes</w:t>
+      </w:r>
+    </w:p>
+    <w:p>
+      <w:pPr>
+        <w:pStyle w:val="ListParagraph"/>
+        <w:numPr>
+          <w:ilvl w:val="0"/>
+          <w:numId w:val="1"/>
+        </w:numPr>
+        <w:rPr>
+          <w:sz w:val="24"/>
+          <w:szCs w:val="22"/>
+          <w:lang w:val="en-US"/>
+        </w:rPr>
+      </w:pPr>
+      <w:r>
+        <w:rPr>
+          <w:sz w:val="24"/>
+          <w:szCs w:val="22"/>
+          <w:lang w:val="en-US"/>
+        </w:rPr>
+        <w:t xml:space="preserve">Launch </w:t>
+      </w:r>
+      <w:hyperlink r:id="rId17" w:history="1">
+        <w:r>
+          <w:rPr>
+            <w:rStyle w:val="Hyperlink"/>
+            <w:sz w:val="24"/>
+            <w:szCs w:val="22"/>
+            <w:lang w:val="en-US"/>
+          </w:rPr>
+          <w:t>https://echoecho.com/htmlforms10.htm</w:t>
+        </w:r>
+      </w:hyperlink>
+    </w:p>
+    <w:p>
+      <w:pPr>
+        <w:pStyle w:val="ListParagraph"/>
+        <w:numPr>
+          <w:ilvl w:val="1"/>
+          <w:numId w:val="1"/>
+        </w:numPr>
+        <w:rPr>
+          <w:sz w:val="24"/>
+          <w:szCs w:val="22"/>
+          <w:lang w:val="en-US"/>
+        </w:rPr>
+      </w:pPr>
+      <w:r>
+        <w:rPr>
+          <w:sz w:val="24"/>
+          <w:szCs w:val="22"/>
+          <w:lang w:val="en-US"/>
+        </w:rPr>
+        <w:t>Display the status of each radio button</w:t>
+      </w:r>
+    </w:p>
+    <w:p>
+      <w:pPr>
+        <w:pStyle w:val="ListParagraph"/>
+        <w:numPr>
+          <w:ilvl w:val="1"/>
+          <w:numId w:val="1"/>
+        </w:numPr>
+        <w:rPr>
+          <w:sz w:val="24"/>
+          <w:szCs w:val="22"/>
+          <w:lang w:val="en-US"/>
+        </w:rPr>
+      </w:pPr>
+      <w:r>
+        <w:rPr>
+          <w:sz w:val="24"/>
+          <w:szCs w:val="22"/>
+          <w:lang w:val="en-US"/>
+        </w:rPr>
+        <w:t>Click on each radio button</w:t>
+      </w:r>
+    </w:p>
+    <w:p>
+      <w:pPr>
+        <w:pStyle w:val="ListParagraph"/>
+        <w:numPr>
+          <w:ilvl w:val="1"/>
+          <w:numId w:val="1"/>
+        </w:numPr>
+        <w:rPr>
+          <w:sz w:val="24"/>
+          <w:szCs w:val="22"/>
+          <w:lang w:val="en-US"/>
+        </w:rPr>
+      </w:pPr>
+      <w:r>
+        <w:rPr>
+          <w:sz w:val="24"/>
+          <w:szCs w:val="22"/>
+          <w:lang w:val="en-US"/>
+        </w:rPr>
+        <w:t>Display the status of each radio button</w:t>
+      </w:r>
+    </w:p>
+    <w:p>
+      <w:pPr>
+        <w:pStyle w:val="ListParagraph"/>
+        <w:numPr>
+          <w:ilvl w:val="0"/>
+          <w:numId w:val="1"/>
+        </w:numPr>
+        <w:rPr>
+          <w:sz w:val="24"/>
+          <w:szCs w:val="22"/>
+          <w:lang w:val="en-US"/>
+        </w:rPr>
+      </w:pPr>
+      <w:bookmarkStart w:id="0" w:name="_GoBack"/>
+      <w:bookmarkEnd w:id="0"/>
     </w:p>
     <w:sectPr>
       <w:pgSz w:w="11906" w:h="16838"/>

</xml_diff>

<commit_message>
Date: 17 Apr 2026
</commit_message>
<xml_diff>
--- a/Assignment_SA2601010.docx
+++ b/Assignment_SA2601010.docx
@@ -2629,6 +2629,43 @@
     </w:p>
     <w:p>
       <w:pPr>
+        <w:rPr>
+          <w:sz w:val="24"/>
+          <w:szCs w:val="24"/>
+          <w:highlight w:val="yellow"/>
+          <w:lang w:val="en-US"/>
+        </w:rPr>
+      </w:pPr>
+    </w:p>
+    <w:p>
+      <w:pPr>
+        <w:rPr>
+          <w:sz w:val="24"/>
+          <w:szCs w:val="24"/>
+          <w:lang w:val="en-US"/>
+        </w:rPr>
+      </w:pPr>
+      <w:r>
+        <w:rPr>
+          <w:sz w:val="24"/>
+          <w:szCs w:val="24"/>
+          <w:lang w:val="en-US"/>
+        </w:rPr>
+        <w:t>Date: 17 April 2026</w:t>
+      </w:r>
+    </w:p>
+    <w:p>
+      <w:pPr>
+        <w:rPr>
+          <w:sz w:val="24"/>
+          <w:szCs w:val="24"/>
+          <w:highlight w:val="yellow"/>
+          <w:lang w:val="en-US"/>
+        </w:rPr>
+      </w:pPr>
+    </w:p>
+    <w:p>
+      <w:pPr>
         <w:pStyle w:val="ListParagraph"/>
         <w:numPr>
           <w:ilvl w:val="0"/>
@@ -2640,8 +2677,1238 @@
           <w:lang w:val="en-US"/>
         </w:rPr>
       </w:pPr>
+      <w:r>
+        <w:rPr>
+          <w:sz w:val="24"/>
+          <w:szCs w:val="22"/>
+          <w:lang w:val="en-US"/>
+        </w:rPr>
+        <w:t>Complete Assignment no 18 using FluentWait</w:t>
+      </w:r>
+    </w:p>
+    <w:p>
+      <w:pPr>
+        <w:pStyle w:val="ListParagraph"/>
+        <w:numPr>
+          <w:ilvl w:val="0"/>
+          <w:numId w:val="1"/>
+        </w:numPr>
+        <w:spacing w:line="254" w:lineRule="auto"/>
+        <w:rPr>
+          <w:sz w:val="24"/>
+          <w:szCs w:val="24"/>
+          <w:highlight w:val="yellow"/>
+          <w:lang w:val="en-US"/>
+        </w:rPr>
+      </w:pPr>
+      <w:r>
+        <w:rPr>
+          <w:sz w:val="24"/>
+          <w:szCs w:val="24"/>
+          <w:highlight w:val="yellow"/>
+          <w:lang w:val="en-US"/>
+        </w:rPr>
+        <w:t xml:space="preserve">Open </w:t>
+      </w:r>
+      <w:hyperlink r:id="rId24" w:history="1">
+        <w:r>
+          <w:rPr>
+            <w:rStyle w:val="Hyperlink"/>
+            <w:sz w:val="24"/>
+            <w:szCs w:val="24"/>
+            <w:highlight w:val="yellow"/>
+            <w:lang w:val="en-US"/>
+          </w:rPr>
+          <w:t>https://opensource-demo.orangehrmlive.com/web/index.php/auth/login</w:t>
+        </w:r>
+      </w:hyperlink>
+    </w:p>
+    <w:p>
+      <w:pPr>
+        <w:pStyle w:val="ListParagraph"/>
+        <w:numPr>
+          <w:ilvl w:val="1"/>
+          <w:numId w:val="1"/>
+        </w:numPr>
+        <w:spacing w:line="254" w:lineRule="auto"/>
+        <w:rPr>
+          <w:sz w:val="24"/>
+          <w:szCs w:val="24"/>
+          <w:highlight w:val="yellow"/>
+          <w:lang w:val="en-US"/>
+        </w:rPr>
+      </w:pPr>
+      <w:r>
+        <w:rPr>
+          <w:sz w:val="24"/>
+          <w:szCs w:val="24"/>
+          <w:highlight w:val="yellow"/>
+          <w:lang w:val="en-US"/>
+        </w:rPr>
+        <w:t>Login with Admin (admin, admin123)</w:t>
+      </w:r>
+    </w:p>
+    <w:p>
+      <w:pPr>
+        <w:pStyle w:val="ListParagraph"/>
+        <w:numPr>
+          <w:ilvl w:val="1"/>
+          <w:numId w:val="1"/>
+        </w:numPr>
+        <w:spacing w:line="254" w:lineRule="auto"/>
+        <w:rPr>
+          <w:sz w:val="24"/>
+          <w:szCs w:val="24"/>
+          <w:highlight w:val="yellow"/>
+          <w:lang w:val="en-US"/>
+        </w:rPr>
+      </w:pPr>
+      <w:r>
+        <w:rPr>
+          <w:sz w:val="24"/>
+          <w:szCs w:val="24"/>
+          <w:highlight w:val="yellow"/>
+          <w:lang w:val="en-US"/>
+        </w:rPr>
+        <w:t>Click on PIM</w:t>
+      </w:r>
+    </w:p>
+    <w:p>
+      <w:pPr>
+        <w:pStyle w:val="ListParagraph"/>
+        <w:numPr>
+          <w:ilvl w:val="1"/>
+          <w:numId w:val="1"/>
+        </w:numPr>
+        <w:spacing w:line="254" w:lineRule="auto"/>
+        <w:rPr>
+          <w:sz w:val="24"/>
+          <w:szCs w:val="24"/>
+          <w:highlight w:val="yellow"/>
+          <w:lang w:val="en-US"/>
+        </w:rPr>
+      </w:pPr>
+      <w:r>
+        <w:rPr>
+          <w:sz w:val="24"/>
+          <w:szCs w:val="24"/>
+          <w:highlight w:val="yellow"/>
+          <w:lang w:val="en-US"/>
+        </w:rPr>
+        <w:t>Click on + Add button</w:t>
+      </w:r>
+    </w:p>
+    <w:p>
+      <w:pPr>
+        <w:pStyle w:val="ListParagraph"/>
+        <w:numPr>
+          <w:ilvl w:val="1"/>
+          <w:numId w:val="1"/>
+        </w:numPr>
+        <w:spacing w:line="254" w:lineRule="auto"/>
+        <w:rPr>
+          <w:sz w:val="24"/>
+          <w:szCs w:val="24"/>
+          <w:highlight w:val="yellow"/>
+          <w:lang w:val="en-US"/>
+        </w:rPr>
+      </w:pPr>
+      <w:r>
+        <w:rPr>
+          <w:sz w:val="24"/>
+          <w:szCs w:val="24"/>
+          <w:highlight w:val="yellow"/>
+          <w:lang w:val="en-US"/>
+        </w:rPr>
+        <w:t>Enter First Name</w:t>
+      </w:r>
+    </w:p>
+    <w:p>
+      <w:pPr>
+        <w:pStyle w:val="ListParagraph"/>
+        <w:numPr>
+          <w:ilvl w:val="1"/>
+          <w:numId w:val="1"/>
+        </w:numPr>
+        <w:spacing w:line="254" w:lineRule="auto"/>
+        <w:rPr>
+          <w:sz w:val="24"/>
+          <w:szCs w:val="24"/>
+          <w:highlight w:val="yellow"/>
+          <w:lang w:val="en-US"/>
+        </w:rPr>
+      </w:pPr>
+      <w:r>
+        <w:rPr>
+          <w:sz w:val="24"/>
+          <w:szCs w:val="24"/>
+          <w:highlight w:val="yellow"/>
+          <w:lang w:val="en-US"/>
+        </w:rPr>
+        <w:t>Enter Middle Name</w:t>
+      </w:r>
+    </w:p>
+    <w:p>
+      <w:pPr>
+        <w:pStyle w:val="ListParagraph"/>
+        <w:numPr>
+          <w:ilvl w:val="1"/>
+          <w:numId w:val="1"/>
+        </w:numPr>
+        <w:spacing w:line="254" w:lineRule="auto"/>
+        <w:rPr>
+          <w:sz w:val="24"/>
+          <w:szCs w:val="24"/>
+          <w:highlight w:val="yellow"/>
+          <w:lang w:val="en-US"/>
+        </w:rPr>
+      </w:pPr>
+      <w:r>
+        <w:rPr>
+          <w:sz w:val="24"/>
+          <w:szCs w:val="24"/>
+          <w:highlight w:val="yellow"/>
+          <w:lang w:val="en-US"/>
+        </w:rPr>
+        <w:t>Enter Last Name</w:t>
+      </w:r>
+    </w:p>
+    <w:p>
+      <w:pPr>
+        <w:pStyle w:val="ListParagraph"/>
+        <w:numPr>
+          <w:ilvl w:val="1"/>
+          <w:numId w:val="1"/>
+        </w:numPr>
+        <w:spacing w:line="254" w:lineRule="auto"/>
+        <w:rPr>
+          <w:sz w:val="24"/>
+          <w:szCs w:val="24"/>
+          <w:highlight w:val="yellow"/>
+          <w:lang w:val="en-US"/>
+        </w:rPr>
+      </w:pPr>
+      <w:r>
+        <w:rPr>
+          <w:sz w:val="24"/>
+          <w:szCs w:val="24"/>
+          <w:highlight w:val="yellow"/>
+          <w:lang w:val="en-US"/>
+        </w:rPr>
+        <w:t>Click on Create Login Details</w:t>
+      </w:r>
+    </w:p>
+    <w:p>
+      <w:pPr>
+        <w:pStyle w:val="ListParagraph"/>
+        <w:numPr>
+          <w:ilvl w:val="1"/>
+          <w:numId w:val="1"/>
+        </w:numPr>
+        <w:spacing w:line="254" w:lineRule="auto"/>
+        <w:rPr>
+          <w:sz w:val="24"/>
+          <w:szCs w:val="24"/>
+          <w:highlight w:val="yellow"/>
+          <w:lang w:val="en-US"/>
+        </w:rPr>
+      </w:pPr>
+      <w:r>
+        <w:rPr>
+          <w:sz w:val="24"/>
+          <w:szCs w:val="24"/>
+          <w:highlight w:val="yellow"/>
+          <w:lang w:val="en-US"/>
+        </w:rPr>
+        <w:t>Enter User Name</w:t>
+      </w:r>
+    </w:p>
+    <w:p>
+      <w:pPr>
+        <w:pStyle w:val="ListParagraph"/>
+        <w:numPr>
+          <w:ilvl w:val="1"/>
+          <w:numId w:val="1"/>
+        </w:numPr>
+        <w:spacing w:line="254" w:lineRule="auto"/>
+        <w:rPr>
+          <w:sz w:val="24"/>
+          <w:szCs w:val="24"/>
+          <w:highlight w:val="yellow"/>
+          <w:lang w:val="en-US"/>
+        </w:rPr>
+      </w:pPr>
+      <w:r>
+        <w:rPr>
+          <w:sz w:val="24"/>
+          <w:szCs w:val="24"/>
+          <w:highlight w:val="yellow"/>
+          <w:lang w:val="en-US"/>
+        </w:rPr>
+        <w:t>Enter Password</w:t>
+      </w:r>
+    </w:p>
+    <w:p>
+      <w:pPr>
+        <w:pStyle w:val="ListParagraph"/>
+        <w:numPr>
+          <w:ilvl w:val="1"/>
+          <w:numId w:val="1"/>
+        </w:numPr>
+        <w:spacing w:line="254" w:lineRule="auto"/>
+        <w:rPr>
+          <w:sz w:val="24"/>
+          <w:szCs w:val="24"/>
+          <w:highlight w:val="yellow"/>
+          <w:lang w:val="en-US"/>
+        </w:rPr>
+      </w:pPr>
+      <w:r>
+        <w:rPr>
+          <w:sz w:val="24"/>
+          <w:szCs w:val="24"/>
+          <w:highlight w:val="yellow"/>
+          <w:lang w:val="en-US"/>
+        </w:rPr>
+        <w:t>Enter Confirm Password</w:t>
+      </w:r>
+    </w:p>
+    <w:p>
+      <w:pPr>
+        <w:pStyle w:val="ListParagraph"/>
+        <w:numPr>
+          <w:ilvl w:val="1"/>
+          <w:numId w:val="1"/>
+        </w:numPr>
+        <w:spacing w:line="254" w:lineRule="auto"/>
+        <w:rPr>
+          <w:sz w:val="24"/>
+          <w:szCs w:val="24"/>
+          <w:highlight w:val="yellow"/>
+          <w:lang w:val="en-US"/>
+        </w:rPr>
+      </w:pPr>
+      <w:r>
+        <w:rPr>
+          <w:sz w:val="24"/>
+          <w:szCs w:val="24"/>
+          <w:highlight w:val="yellow"/>
+          <w:lang w:val="en-US"/>
+        </w:rPr>
+        <w:lastRenderedPageBreak/>
+        <w:t>Click on Save Button</w:t>
+      </w:r>
+    </w:p>
+    <w:p>
+      <w:pPr>
+        <w:pStyle w:val="ListParagraph"/>
+        <w:numPr>
+          <w:ilvl w:val="1"/>
+          <w:numId w:val="1"/>
+        </w:numPr>
+        <w:spacing w:line="254" w:lineRule="auto"/>
+        <w:rPr>
+          <w:sz w:val="24"/>
+          <w:szCs w:val="24"/>
+          <w:highlight w:val="yellow"/>
+          <w:lang w:val="en-US"/>
+        </w:rPr>
+      </w:pPr>
+      <w:r>
+        <w:rPr>
+          <w:sz w:val="24"/>
+          <w:szCs w:val="24"/>
+          <w:highlight w:val="yellow"/>
+          <w:lang w:val="en-US"/>
+        </w:rPr>
+        <w:t>Logout</w:t>
+      </w:r>
+    </w:p>
+    <w:p>
+      <w:pPr>
+        <w:pStyle w:val="ListParagraph"/>
+        <w:numPr>
+          <w:ilvl w:val="1"/>
+          <w:numId w:val="1"/>
+        </w:numPr>
+        <w:spacing w:line="254" w:lineRule="auto"/>
+        <w:rPr>
+          <w:sz w:val="24"/>
+          <w:szCs w:val="24"/>
+          <w:highlight w:val="yellow"/>
+          <w:lang w:val="en-US"/>
+        </w:rPr>
+      </w:pPr>
+      <w:r>
+        <w:rPr>
+          <w:sz w:val="24"/>
+          <w:szCs w:val="24"/>
+          <w:highlight w:val="yellow"/>
+          <w:lang w:val="en-US"/>
+        </w:rPr>
+        <w:t xml:space="preserve">Login using data provided in step no h &amp; </w:t>
+      </w:r>
+      <w:proofErr w:type="spellStart"/>
+      <w:r>
+        <w:rPr>
+          <w:sz w:val="24"/>
+          <w:szCs w:val="24"/>
+          <w:highlight w:val="yellow"/>
+          <w:lang w:val="en-US"/>
+        </w:rPr>
+        <w:t>i</w:t>
+      </w:r>
+      <w:proofErr w:type="spellEnd"/>
+    </w:p>
+    <w:p>
+      <w:pPr>
+        <w:pStyle w:val="ListParagraph"/>
+        <w:numPr>
+          <w:ilvl w:val="1"/>
+          <w:numId w:val="1"/>
+        </w:numPr>
+        <w:spacing w:line="254" w:lineRule="auto"/>
+        <w:rPr>
+          <w:sz w:val="24"/>
+          <w:szCs w:val="24"/>
+          <w:highlight w:val="yellow"/>
+          <w:lang w:val="en-US"/>
+        </w:rPr>
+      </w:pPr>
+      <w:r>
+        <w:rPr>
+          <w:sz w:val="24"/>
+          <w:szCs w:val="24"/>
+          <w:highlight w:val="yellow"/>
+          <w:lang w:val="en-US"/>
+        </w:rPr>
+        <w:t>Display name of employee on logout link</w:t>
+      </w:r>
+    </w:p>
+    <w:p>
+      <w:pPr>
+        <w:pStyle w:val="ListParagraph"/>
+        <w:numPr>
+          <w:ilvl w:val="1"/>
+          <w:numId w:val="1"/>
+        </w:numPr>
+        <w:spacing w:line="254" w:lineRule="auto"/>
+        <w:rPr>
+          <w:sz w:val="24"/>
+          <w:szCs w:val="24"/>
+          <w:highlight w:val="yellow"/>
+          <w:lang w:val="en-US"/>
+        </w:rPr>
+      </w:pPr>
+      <w:r>
+        <w:rPr>
+          <w:sz w:val="24"/>
+          <w:szCs w:val="24"/>
+          <w:highlight w:val="yellow"/>
+          <w:lang w:val="en-US"/>
+        </w:rPr>
+        <w:t>Click on My Info</w:t>
+      </w:r>
+    </w:p>
+    <w:p>
+      <w:pPr>
+        <w:pStyle w:val="ListParagraph"/>
+        <w:numPr>
+          <w:ilvl w:val="1"/>
+          <w:numId w:val="1"/>
+        </w:numPr>
+        <w:spacing w:line="254" w:lineRule="auto"/>
+        <w:rPr>
+          <w:sz w:val="24"/>
+          <w:szCs w:val="24"/>
+          <w:highlight w:val="yellow"/>
+          <w:lang w:val="en-US"/>
+        </w:rPr>
+      </w:pPr>
+      <w:r>
+        <w:rPr>
+          <w:sz w:val="24"/>
+          <w:szCs w:val="24"/>
+          <w:highlight w:val="yellow"/>
+          <w:lang w:val="en-US"/>
+        </w:rPr>
+        <w:t>Display the Employee ID</w:t>
+      </w:r>
+    </w:p>
+    <w:p>
+      <w:pPr>
+        <w:pStyle w:val="ListParagraph"/>
+        <w:numPr>
+          <w:ilvl w:val="1"/>
+          <w:numId w:val="1"/>
+        </w:numPr>
+        <w:spacing w:line="254" w:lineRule="auto"/>
+        <w:rPr>
+          <w:sz w:val="24"/>
+          <w:szCs w:val="24"/>
+          <w:highlight w:val="yellow"/>
+          <w:lang w:val="en-US"/>
+        </w:rPr>
+      </w:pPr>
+      <w:r>
+        <w:rPr>
+          <w:sz w:val="24"/>
+          <w:szCs w:val="24"/>
+          <w:highlight w:val="yellow"/>
+          <w:lang w:val="en-US"/>
+        </w:rPr>
+        <w:t>Logout</w:t>
+      </w:r>
+    </w:p>
+    <w:p>
+      <w:pPr>
+        <w:pStyle w:val="ListParagraph"/>
+        <w:numPr>
+          <w:ilvl w:val="1"/>
+          <w:numId w:val="1"/>
+        </w:numPr>
+        <w:spacing w:line="254" w:lineRule="auto"/>
+        <w:rPr>
+          <w:sz w:val="24"/>
+          <w:szCs w:val="24"/>
+          <w:highlight w:val="yellow"/>
+          <w:lang w:val="en-US"/>
+        </w:rPr>
+      </w:pPr>
+      <w:r>
+        <w:rPr>
+          <w:sz w:val="24"/>
+          <w:szCs w:val="24"/>
+          <w:highlight w:val="yellow"/>
+          <w:lang w:val="en-US"/>
+        </w:rPr>
+        <w:t>Login with admin</w:t>
+      </w:r>
+    </w:p>
+    <w:p>
+      <w:pPr>
+        <w:pStyle w:val="ListParagraph"/>
+        <w:numPr>
+          <w:ilvl w:val="1"/>
+          <w:numId w:val="1"/>
+        </w:numPr>
+        <w:spacing w:line="254" w:lineRule="auto"/>
+        <w:rPr>
+          <w:sz w:val="24"/>
+          <w:szCs w:val="24"/>
+          <w:highlight w:val="yellow"/>
+          <w:lang w:val="en-US"/>
+        </w:rPr>
+      </w:pPr>
+      <w:r>
+        <w:rPr>
+          <w:sz w:val="24"/>
+          <w:szCs w:val="24"/>
+          <w:highlight w:val="yellow"/>
+          <w:lang w:val="en-US"/>
+        </w:rPr>
+        <w:t>Click on Admin</w:t>
+      </w:r>
+    </w:p>
+    <w:p>
+      <w:pPr>
+        <w:pStyle w:val="ListParagraph"/>
+        <w:numPr>
+          <w:ilvl w:val="1"/>
+          <w:numId w:val="1"/>
+        </w:numPr>
+        <w:spacing w:line="254" w:lineRule="auto"/>
+        <w:rPr>
+          <w:sz w:val="24"/>
+          <w:szCs w:val="24"/>
+          <w:highlight w:val="yellow"/>
+          <w:lang w:val="en-US"/>
+        </w:rPr>
+      </w:pPr>
+      <w:r>
+        <w:rPr>
+          <w:sz w:val="24"/>
+          <w:szCs w:val="24"/>
+          <w:highlight w:val="yellow"/>
+          <w:lang w:val="en-US"/>
+        </w:rPr>
+        <w:t>Enter user name</w:t>
+      </w:r>
+    </w:p>
+    <w:p>
+      <w:pPr>
+        <w:pStyle w:val="ListParagraph"/>
+        <w:numPr>
+          <w:ilvl w:val="1"/>
+          <w:numId w:val="1"/>
+        </w:numPr>
+        <w:spacing w:line="254" w:lineRule="auto"/>
+        <w:rPr>
+          <w:sz w:val="24"/>
+          <w:szCs w:val="24"/>
+          <w:highlight w:val="yellow"/>
+          <w:lang w:val="en-US"/>
+        </w:rPr>
+      </w:pPr>
+      <w:r>
+        <w:rPr>
+          <w:sz w:val="24"/>
+          <w:szCs w:val="24"/>
+          <w:highlight w:val="yellow"/>
+          <w:lang w:val="en-US"/>
+        </w:rPr>
+        <w:t xml:space="preserve">Click on Search </w:t>
+      </w:r>
+    </w:p>
+    <w:p>
+      <w:pPr>
+        <w:pStyle w:val="ListParagraph"/>
+        <w:numPr>
+          <w:ilvl w:val="1"/>
+          <w:numId w:val="1"/>
+        </w:numPr>
+        <w:spacing w:line="254" w:lineRule="auto"/>
+        <w:rPr>
+          <w:sz w:val="24"/>
+          <w:szCs w:val="24"/>
+          <w:highlight w:val="yellow"/>
+          <w:lang w:val="en-US"/>
+        </w:rPr>
+      </w:pPr>
+      <w:r>
+        <w:rPr>
+          <w:sz w:val="24"/>
+          <w:szCs w:val="24"/>
+          <w:highlight w:val="yellow"/>
+          <w:lang w:val="en-US"/>
+        </w:rPr>
+        <w:t>Delete the record displayed</w:t>
+      </w:r>
+    </w:p>
+    <w:p>
+      <w:pPr>
+        <w:pStyle w:val="ListParagraph"/>
+        <w:numPr>
+          <w:ilvl w:val="1"/>
+          <w:numId w:val="1"/>
+        </w:numPr>
+        <w:rPr>
+          <w:sz w:val="24"/>
+          <w:szCs w:val="22"/>
+          <w:highlight w:val="yellow"/>
+          <w:lang w:val="en-US"/>
+        </w:rPr>
+      </w:pPr>
+      <w:r>
+        <w:rPr>
+          <w:sz w:val="24"/>
+          <w:szCs w:val="24"/>
+          <w:highlight w:val="yellow"/>
+          <w:lang w:val="en-US"/>
+        </w:rPr>
+        <w:t>Logout</w:t>
+      </w:r>
+      <w:r>
+        <w:rPr>
+          <w:sz w:val="24"/>
+          <w:szCs w:val="24"/>
+          <w:highlight w:val="yellow"/>
+          <w:lang w:val="en-US"/>
+        </w:rPr>
+        <w:tab/>
+      </w:r>
+    </w:p>
+    <w:p>
+      <w:pPr>
+        <w:pStyle w:val="ListParagraph"/>
+        <w:numPr>
+          <w:ilvl w:val="0"/>
+          <w:numId w:val="1"/>
+        </w:numPr>
+        <w:rPr>
+          <w:sz w:val="24"/>
+          <w:szCs w:val="22"/>
+          <w:lang w:val="en-US"/>
+        </w:rPr>
+      </w:pPr>
+      <w:r>
+        <w:rPr>
+          <w:sz w:val="24"/>
+          <w:szCs w:val="22"/>
+          <w:lang w:val="en-US"/>
+        </w:rPr>
+        <w:t xml:space="preserve">Additional Assignments on </w:t>
+      </w:r>
+      <w:hyperlink r:id="rId25" w:history="1">
+        <w:r>
+          <w:rPr>
+            <w:rStyle w:val="Hyperlink"/>
+            <w:sz w:val="24"/>
+            <w:szCs w:val="22"/>
+            <w:lang w:val="en-US"/>
+          </w:rPr>
+          <w:t>https://automationexercise.com/test_cases</w:t>
+        </w:r>
+      </w:hyperlink>
+    </w:p>
+    <w:p>
+      <w:pPr>
+        <w:pStyle w:val="ListParagraph"/>
+        <w:numPr>
+          <w:ilvl w:val="0"/>
+          <w:numId w:val="1"/>
+        </w:numPr>
+        <w:spacing w:line="254" w:lineRule="auto"/>
+        <w:rPr>
+          <w:sz w:val="24"/>
+          <w:szCs w:val="24"/>
+          <w:lang w:val="en-US"/>
+        </w:rPr>
+      </w:pPr>
+      <w:r>
+        <w:rPr>
+          <w:sz w:val="24"/>
+          <w:szCs w:val="24"/>
+          <w:lang w:val="en-US"/>
+        </w:rPr>
+        <w:t xml:space="preserve">Open </w:t>
+      </w:r>
+      <w:hyperlink r:id="rId26" w:history="1">
+        <w:r>
+          <w:rPr>
+            <w:rStyle w:val="Hyperlink"/>
+            <w:sz w:val="24"/>
+            <w:szCs w:val="24"/>
+            <w:lang w:val="en-US"/>
+          </w:rPr>
+          <w:t>https://www.rediff.com/</w:t>
+        </w:r>
+      </w:hyperlink>
+      <w:r>
+        <w:rPr>
+          <w:sz w:val="24"/>
+          <w:szCs w:val="24"/>
+          <w:lang w:val="en-US"/>
+        </w:rPr>
+        <w:t xml:space="preserve"> </w:t>
+      </w:r>
+    </w:p>
+    <w:p>
+      <w:pPr>
+        <w:pStyle w:val="ListParagraph"/>
+        <w:numPr>
+          <w:ilvl w:val="1"/>
+          <w:numId w:val="1"/>
+        </w:numPr>
+        <w:spacing w:line="254" w:lineRule="auto"/>
+        <w:rPr>
+          <w:sz w:val="24"/>
+          <w:szCs w:val="24"/>
+          <w:lang w:val="en-US"/>
+        </w:rPr>
+      </w:pPr>
+      <w:r>
+        <w:rPr>
+          <w:sz w:val="24"/>
+          <w:szCs w:val="24"/>
+          <w:lang w:val="en-US"/>
+        </w:rPr>
+        <w:t>Click on Money</w:t>
+      </w:r>
+    </w:p>
+    <w:p>
+      <w:pPr>
+        <w:pStyle w:val="ListParagraph"/>
+        <w:numPr>
+          <w:ilvl w:val="1"/>
+          <w:numId w:val="1"/>
+        </w:numPr>
+        <w:spacing w:line="254" w:lineRule="auto"/>
+        <w:rPr>
+          <w:sz w:val="24"/>
+          <w:szCs w:val="24"/>
+          <w:lang w:val="en-US"/>
+        </w:rPr>
+      </w:pPr>
+      <w:r>
+        <w:rPr>
+          <w:sz w:val="24"/>
+          <w:szCs w:val="24"/>
+          <w:lang w:val="en-US"/>
+        </w:rPr>
+        <w:t>Click on More Gainers</w:t>
+      </w:r>
+    </w:p>
+    <w:p>
+      <w:pPr>
+        <w:pStyle w:val="ListParagraph"/>
+        <w:numPr>
+          <w:ilvl w:val="1"/>
+          <w:numId w:val="1"/>
+        </w:numPr>
+        <w:spacing w:line="254" w:lineRule="auto"/>
+        <w:rPr>
+          <w:sz w:val="24"/>
+          <w:szCs w:val="24"/>
+          <w:lang w:val="en-US"/>
+        </w:rPr>
+      </w:pPr>
+      <w:r>
+        <w:rPr>
+          <w:sz w:val="24"/>
+          <w:szCs w:val="24"/>
+          <w:lang w:val="en-US"/>
+        </w:rPr>
+        <w:t>Display title of all the headers</w:t>
+      </w:r>
+    </w:p>
+    <w:p>
+      <w:pPr>
+        <w:pStyle w:val="ListParagraph"/>
+        <w:numPr>
+          <w:ilvl w:val="1"/>
+          <w:numId w:val="1"/>
+        </w:numPr>
+        <w:spacing w:line="254" w:lineRule="auto"/>
+        <w:rPr>
+          <w:sz w:val="24"/>
+          <w:szCs w:val="24"/>
+          <w:lang w:val="en-US"/>
+        </w:rPr>
+      </w:pPr>
+      <w:r>
+        <w:rPr>
+          <w:sz w:val="24"/>
+          <w:szCs w:val="24"/>
+          <w:lang w:val="en-US"/>
+        </w:rPr>
+        <w:t>Display total no of rows</w:t>
+      </w:r>
+    </w:p>
+    <w:p>
+      <w:pPr>
+        <w:pStyle w:val="ListParagraph"/>
+        <w:numPr>
+          <w:ilvl w:val="1"/>
+          <w:numId w:val="1"/>
+        </w:numPr>
+        <w:spacing w:line="254" w:lineRule="auto"/>
+        <w:rPr>
+          <w:b/>
+          <w:bCs/>
+          <w:sz w:val="24"/>
+          <w:szCs w:val="24"/>
+          <w:lang w:val="en-US"/>
+        </w:rPr>
+      </w:pPr>
+      <w:r>
+        <w:rPr>
+          <w:b/>
+          <w:bCs/>
+          <w:sz w:val="24"/>
+          <w:szCs w:val="24"/>
+          <w:lang w:val="en-US"/>
+        </w:rPr>
+        <w:t>Display any row randomly</w:t>
+      </w:r>
+      <w:r>
+        <w:rPr>
+          <w:b/>
+          <w:bCs/>
+          <w:sz w:val="24"/>
+          <w:szCs w:val="24"/>
+          <w:lang w:val="en-US"/>
+        </w:rPr>
+        <w:t xml:space="preserve"> (Use Random class from Java)</w:t>
+      </w:r>
+    </w:p>
+    <w:p>
+      <w:pPr>
+        <w:pStyle w:val="ListParagraph"/>
+        <w:numPr>
+          <w:ilvl w:val="1"/>
+          <w:numId w:val="1"/>
+        </w:numPr>
+        <w:spacing w:line="254" w:lineRule="auto"/>
+        <w:rPr>
+          <w:sz w:val="24"/>
+          <w:szCs w:val="24"/>
+          <w:lang w:val="en-US"/>
+        </w:rPr>
+      </w:pPr>
+      <w:r>
+        <w:rPr>
+          <w:sz w:val="24"/>
+          <w:szCs w:val="24"/>
+          <w:lang w:val="en-US"/>
+        </w:rPr>
+        <w:t>Display list of all the companies (Company name only)</w:t>
+      </w:r>
+    </w:p>
+    <w:p>
+      <w:pPr>
+        <w:pStyle w:val="ListParagraph"/>
+        <w:numPr>
+          <w:ilvl w:val="1"/>
+          <w:numId w:val="1"/>
+        </w:numPr>
+        <w:rPr>
+          <w:sz w:val="24"/>
+          <w:szCs w:val="22"/>
+          <w:lang w:val="en-US"/>
+        </w:rPr>
+      </w:pPr>
+      <w:r>
+        <w:rPr>
+          <w:sz w:val="24"/>
+          <w:szCs w:val="24"/>
+          <w:lang w:val="en-US"/>
+        </w:rPr>
+        <w:t>Read all current price and display the highest price.</w:t>
+      </w:r>
+      <w:r>
+        <w:rPr>
+          <w:sz w:val="24"/>
+          <w:szCs w:val="24"/>
+          <w:lang w:val="en-US"/>
+        </w:rPr>
+        <w:br/>
+        <w:t>(Read all the current price, store in array and then sort an array so you will get highest price)</w:t>
+      </w:r>
+    </w:p>
+    <w:p>
+      <w:pPr>
+        <w:pStyle w:val="ListParagraph"/>
+        <w:numPr>
+          <w:ilvl w:val="0"/>
+          <w:numId w:val="1"/>
+        </w:numPr>
+        <w:spacing w:line="254" w:lineRule="auto"/>
+        <w:rPr>
+          <w:sz w:val="24"/>
+          <w:szCs w:val="24"/>
+          <w:lang w:val="en-US"/>
+        </w:rPr>
+      </w:pPr>
+      <w:r>
+        <w:rPr>
+          <w:sz w:val="24"/>
+          <w:szCs w:val="24"/>
+          <w:lang w:val="en-US"/>
+        </w:rPr>
+        <w:t xml:space="preserve">Open </w:t>
+      </w:r>
+      <w:hyperlink r:id="rId27" w:history="1">
+        <w:r>
+          <w:rPr>
+            <w:rStyle w:val="Hyperlink"/>
+            <w:sz w:val="24"/>
+            <w:szCs w:val="24"/>
+            <w:lang w:val="en-US"/>
+          </w:rPr>
+          <w:t>https://demoqa.com/webtables</w:t>
+        </w:r>
+      </w:hyperlink>
+      <w:r>
+        <w:rPr>
+          <w:sz w:val="24"/>
+          <w:szCs w:val="24"/>
+          <w:lang w:val="en-US"/>
+        </w:rPr>
+        <w:t xml:space="preserve"> </w:t>
+      </w:r>
+    </w:p>
+    <w:p>
+      <w:pPr>
+        <w:pStyle w:val="ListParagraph"/>
+        <w:numPr>
+          <w:ilvl w:val="1"/>
+          <w:numId w:val="1"/>
+        </w:numPr>
+        <w:spacing w:line="254" w:lineRule="auto"/>
+        <w:rPr>
+          <w:sz w:val="24"/>
+          <w:szCs w:val="24"/>
+          <w:lang w:val="en-US"/>
+        </w:rPr>
+      </w:pPr>
+      <w:r>
+        <w:rPr>
+          <w:sz w:val="24"/>
+          <w:szCs w:val="24"/>
+          <w:lang w:val="en-US"/>
+        </w:rPr>
+        <w:t>Try to display all header columns</w:t>
+      </w:r>
+    </w:p>
+    <w:p>
+      <w:pPr>
+        <w:pStyle w:val="ListParagraph"/>
+        <w:numPr>
+          <w:ilvl w:val="1"/>
+          <w:numId w:val="1"/>
+        </w:numPr>
+        <w:spacing w:line="254" w:lineRule="auto"/>
+        <w:rPr>
+          <w:sz w:val="24"/>
+          <w:szCs w:val="24"/>
+          <w:lang w:val="en-US"/>
+        </w:rPr>
+      </w:pPr>
+      <w:r>
+        <w:rPr>
+          <w:sz w:val="24"/>
+          <w:szCs w:val="24"/>
+          <w:lang w:val="en-US"/>
+        </w:rPr>
+        <w:t>Click on Add button</w:t>
+      </w:r>
       <w:bookmarkStart w:id="0" w:name="_GoBack"/>
       <w:bookmarkEnd w:id="0"/>
+    </w:p>
+    <w:p>
+      <w:pPr>
+        <w:pStyle w:val="ListParagraph"/>
+        <w:numPr>
+          <w:ilvl w:val="1"/>
+          <w:numId w:val="1"/>
+        </w:numPr>
+        <w:spacing w:line="254" w:lineRule="auto"/>
+        <w:rPr>
+          <w:sz w:val="24"/>
+          <w:szCs w:val="24"/>
+          <w:lang w:val="en-US"/>
+        </w:rPr>
+      </w:pPr>
+      <w:r>
+        <w:rPr>
+          <w:sz w:val="24"/>
+          <w:szCs w:val="24"/>
+          <w:lang w:val="en-US"/>
+        </w:rPr>
+        <w:t>Enter all the data</w:t>
+      </w:r>
+    </w:p>
+    <w:p>
+      <w:pPr>
+        <w:pStyle w:val="ListParagraph"/>
+        <w:numPr>
+          <w:ilvl w:val="1"/>
+          <w:numId w:val="1"/>
+        </w:numPr>
+        <w:spacing w:line="254" w:lineRule="auto"/>
+        <w:rPr>
+          <w:sz w:val="24"/>
+          <w:szCs w:val="24"/>
+          <w:lang w:val="en-US"/>
+        </w:rPr>
+      </w:pPr>
+      <w:r>
+        <w:rPr>
+          <w:sz w:val="24"/>
+          <w:szCs w:val="24"/>
+          <w:lang w:val="en-US"/>
+        </w:rPr>
+        <w:t>Search the first name in First Name column</w:t>
+      </w:r>
+    </w:p>
+    <w:p>
+      <w:pPr>
+        <w:pStyle w:val="ListParagraph"/>
+        <w:numPr>
+          <w:ilvl w:val="1"/>
+          <w:numId w:val="1"/>
+        </w:numPr>
+        <w:spacing w:line="254" w:lineRule="auto"/>
+        <w:rPr>
+          <w:sz w:val="24"/>
+          <w:szCs w:val="24"/>
+          <w:lang w:val="en-US"/>
+        </w:rPr>
+      </w:pPr>
+      <w:r>
+        <w:rPr>
+          <w:sz w:val="24"/>
+          <w:szCs w:val="24"/>
+          <w:lang w:val="en-US"/>
+        </w:rPr>
+        <w:t>Click on delete button in the same row (Don’t copy the xpath of delete button from last row)</w:t>
+      </w:r>
+    </w:p>
+    <w:p>
+      <w:pPr>
+        <w:pStyle w:val="ListParagraph"/>
+        <w:numPr>
+          <w:ilvl w:val="0"/>
+          <w:numId w:val="1"/>
+        </w:numPr>
+        <w:spacing w:line="254" w:lineRule="auto"/>
+        <w:rPr>
+          <w:sz w:val="24"/>
+          <w:szCs w:val="24"/>
+          <w:lang w:val="en-US"/>
+        </w:rPr>
+      </w:pPr>
+      <w:r>
+        <w:rPr>
+          <w:sz w:val="24"/>
+          <w:szCs w:val="24"/>
+          <w:lang w:val="en-US"/>
+        </w:rPr>
+        <w:t xml:space="preserve">Open </w:t>
+      </w:r>
+      <w:hyperlink r:id="rId28" w:history="1">
+        <w:r>
+          <w:rPr>
+            <w:rStyle w:val="Hyperlink"/>
+            <w:sz w:val="24"/>
+            <w:szCs w:val="24"/>
+            <w:lang w:val="en-US"/>
+          </w:rPr>
+          <w:t>https://www.iplt20.com/points-table/men/2024</w:t>
+        </w:r>
+      </w:hyperlink>
+      <w:r>
+        <w:rPr>
+          <w:sz w:val="24"/>
+          <w:szCs w:val="24"/>
+          <w:lang w:val="en-US"/>
+        </w:rPr>
+        <w:t xml:space="preserve"> </w:t>
+      </w:r>
+    </w:p>
+    <w:p>
+      <w:pPr>
+        <w:pStyle w:val="ListParagraph"/>
+        <w:numPr>
+          <w:ilvl w:val="1"/>
+          <w:numId w:val="1"/>
+        </w:numPr>
+        <w:spacing w:line="254" w:lineRule="auto"/>
+        <w:rPr>
+          <w:sz w:val="24"/>
+          <w:szCs w:val="24"/>
+          <w:lang w:val="en-US"/>
+        </w:rPr>
+      </w:pPr>
+      <w:r>
+        <w:rPr>
+          <w:sz w:val="24"/>
+          <w:szCs w:val="24"/>
+          <w:lang w:val="en-US"/>
+        </w:rPr>
+        <w:t>Display list of all the Teams</w:t>
+      </w:r>
+    </w:p>
+    <w:p>
+      <w:pPr>
+        <w:pStyle w:val="ListParagraph"/>
+        <w:numPr>
+          <w:ilvl w:val="1"/>
+          <w:numId w:val="1"/>
+        </w:numPr>
+        <w:spacing w:line="254" w:lineRule="auto"/>
+        <w:rPr>
+          <w:sz w:val="24"/>
+          <w:szCs w:val="24"/>
+          <w:lang w:val="en-US"/>
+        </w:rPr>
+      </w:pPr>
+      <w:r>
+        <w:rPr>
+          <w:sz w:val="24"/>
+          <w:szCs w:val="24"/>
+          <w:lang w:val="en-US"/>
+        </w:rPr>
+        <w:t>Display all result of each team about N W L</w:t>
+      </w:r>
+    </w:p>
+    <w:p>
+      <w:pPr>
+        <w:pStyle w:val="ListParagraph"/>
+        <w:numPr>
+          <w:ilvl w:val="1"/>
+          <w:numId w:val="1"/>
+        </w:numPr>
+        <w:spacing w:line="254" w:lineRule="auto"/>
+        <w:rPr>
+          <w:sz w:val="24"/>
+          <w:szCs w:val="24"/>
+          <w:lang w:val="en-US"/>
+        </w:rPr>
+      </w:pPr>
+      <w:r>
+        <w:rPr>
+          <w:sz w:val="24"/>
+          <w:szCs w:val="24"/>
+          <w:lang w:val="en-US"/>
+        </w:rPr>
+        <w:t>Display count of N, W &amp; L</w:t>
+      </w:r>
+    </w:p>
+    <w:p>
+      <w:pPr>
+        <w:pStyle w:val="ListParagraph"/>
+        <w:numPr>
+          <w:ilvl w:val="1"/>
+          <w:numId w:val="1"/>
+        </w:numPr>
+        <w:spacing w:line="254" w:lineRule="auto"/>
+        <w:rPr>
+          <w:sz w:val="24"/>
+          <w:szCs w:val="24"/>
+          <w:lang w:val="en-US"/>
+        </w:rPr>
+      </w:pPr>
+      <w:r>
+        <w:rPr>
+          <w:sz w:val="24"/>
+          <w:szCs w:val="24"/>
+          <w:lang w:val="en-US"/>
+        </w:rPr>
+        <w:t>Display the result as follow</w:t>
+      </w:r>
+      <w:r>
+        <w:rPr>
+          <w:sz w:val="24"/>
+          <w:szCs w:val="24"/>
+          <w:lang w:val="en-US"/>
+        </w:rPr>
+        <w:br/>
+        <w:t>KKR</w:t>
+      </w:r>
+      <w:r>
+        <w:rPr>
+          <w:sz w:val="24"/>
+          <w:szCs w:val="24"/>
+          <w:lang w:val="en-US"/>
+        </w:rPr>
+        <w:tab/>
+        <w:t>NNWWW</w:t>
+      </w:r>
+      <w:r>
+        <w:rPr>
+          <w:sz w:val="24"/>
+          <w:szCs w:val="24"/>
+          <w:lang w:val="en-US"/>
+        </w:rPr>
+        <w:tab/>
+        <w:t>N-2, W-3, L-0</w:t>
+      </w:r>
+    </w:p>
+    <w:p>
+      <w:pPr>
+        <w:pStyle w:val="ListParagraph"/>
+        <w:numPr>
+          <w:ilvl w:val="0"/>
+          <w:numId w:val="1"/>
+        </w:numPr>
+        <w:rPr>
+          <w:sz w:val="24"/>
+          <w:szCs w:val="22"/>
+          <w:lang w:val="en-US"/>
+        </w:rPr>
+      </w:pPr>
       <w:r>
         <w:rPr>
           <w:sz w:val="24"/>

</xml_diff>

<commit_message>
Date: 21 Apr 2026
</commit_message>
<xml_diff>
--- a/Assignment_SA2601010.docx
+++ b/Assignment_SA2601010.docx
@@ -3663,8 +3663,6 @@
         </w:rPr>
         <w:t>Click on Add button</w:t>
       </w:r>
-      <w:bookmarkStart w:id="0" w:name="_GoBack"/>
-      <w:bookmarkEnd w:id="0"/>
     </w:p>
     <w:p>
       <w:pPr>
@@ -3898,6 +3896,44 @@
     </w:p>
     <w:p>
       <w:pPr>
+        <w:spacing w:line="254" w:lineRule="auto"/>
+        <w:rPr>
+          <w:sz w:val="24"/>
+          <w:szCs w:val="24"/>
+          <w:lang w:val="en-US"/>
+        </w:rPr>
+      </w:pPr>
+    </w:p>
+    <w:p>
+      <w:pPr>
+        <w:spacing w:line="254" w:lineRule="auto"/>
+        <w:rPr>
+          <w:sz w:val="24"/>
+          <w:szCs w:val="24"/>
+          <w:lang w:val="en-US"/>
+        </w:rPr>
+      </w:pPr>
+      <w:r>
+        <w:rPr>
+          <w:sz w:val="24"/>
+          <w:szCs w:val="24"/>
+          <w:lang w:val="en-US"/>
+        </w:rPr>
+        <w:t>Date: 21 April 2026</w:t>
+      </w:r>
+    </w:p>
+    <w:p>
+      <w:pPr>
+        <w:spacing w:line="254" w:lineRule="auto"/>
+        <w:rPr>
+          <w:sz w:val="24"/>
+          <w:szCs w:val="24"/>
+          <w:lang w:val="en-US"/>
+        </w:rPr>
+      </w:pPr>
+    </w:p>
+    <w:p>
+      <w:pPr>
         <w:pStyle w:val="ListParagraph"/>
         <w:numPr>
           <w:ilvl w:val="0"/>
@@ -3909,6 +3945,108 @@
           <w:lang w:val="en-US"/>
         </w:rPr>
       </w:pPr>
+      <w:r>
+        <w:rPr>
+          <w:sz w:val="24"/>
+          <w:szCs w:val="22"/>
+          <w:lang w:val="en-US"/>
+        </w:rPr>
+        <w:t xml:space="preserve">Launch </w:t>
+      </w:r>
+      <w:hyperlink r:id="rId29" w:history="1">
+        <w:r>
+          <w:rPr>
+            <w:rStyle w:val="Hyperlink"/>
+            <w:sz w:val="24"/>
+            <w:szCs w:val="22"/>
+            <w:lang w:val="en-US"/>
+          </w:rPr>
+          <w:t>https://demoqa.com/automation-practice-form</w:t>
+        </w:r>
+      </w:hyperlink>
+    </w:p>
+    <w:p>
+      <w:pPr>
+        <w:pStyle w:val="ListParagraph"/>
+        <w:numPr>
+          <w:ilvl w:val="1"/>
+          <w:numId w:val="1"/>
+        </w:numPr>
+        <w:rPr>
+          <w:sz w:val="24"/>
+          <w:szCs w:val="22"/>
+          <w:lang w:val="en-US"/>
+        </w:rPr>
+      </w:pPr>
+      <w:r>
+        <w:rPr>
+          <w:sz w:val="24"/>
+          <w:szCs w:val="22"/>
+          <w:lang w:val="en-US"/>
+        </w:rPr>
+        <w:t>Complete the registration</w:t>
+      </w:r>
+    </w:p>
+    <w:p>
+      <w:pPr>
+        <w:pStyle w:val="ListParagraph"/>
+        <w:numPr>
+          <w:ilvl w:val="1"/>
+          <w:numId w:val="1"/>
+        </w:numPr>
+        <w:rPr>
+          <w:sz w:val="24"/>
+          <w:szCs w:val="22"/>
+          <w:lang w:val="en-US"/>
+        </w:rPr>
+      </w:pPr>
+      <w:r>
+        <w:rPr>
+          <w:sz w:val="24"/>
+          <w:szCs w:val="22"/>
+          <w:lang w:val="en-US"/>
+        </w:rPr>
+        <w:lastRenderedPageBreak/>
+        <w:t>Click on Submit</w:t>
+      </w:r>
+    </w:p>
+    <w:p>
+      <w:pPr>
+        <w:pStyle w:val="ListParagraph"/>
+        <w:numPr>
+          <w:ilvl w:val="1"/>
+          <w:numId w:val="1"/>
+        </w:numPr>
+        <w:rPr>
+          <w:sz w:val="24"/>
+          <w:szCs w:val="22"/>
+          <w:lang w:val="en-US"/>
+        </w:rPr>
+      </w:pPr>
+      <w:r>
+        <w:rPr>
+          <w:sz w:val="24"/>
+          <w:szCs w:val="22"/>
+          <w:lang w:val="en-US"/>
+        </w:rPr>
+        <w:t>Display the table after submitting</w:t>
+      </w:r>
+    </w:p>
+    <w:p>
+      <w:pPr>
+        <w:pStyle w:val="ListParagraph"/>
+        <w:numPr>
+          <w:ilvl w:val="0"/>
+          <w:numId w:val="1"/>
+        </w:numPr>
+        <w:rPr>
+          <w:sz w:val="24"/>
+          <w:szCs w:val="22"/>
+          <w:lang w:val="en-US"/>
+        </w:rPr>
+      </w:pPr>
+      <w:bookmarkStart w:id="0" w:name="_GoBack"/>
+      <w:bookmarkEnd w:id="0"/>
       <w:r>
         <w:rPr>
           <w:sz w:val="24"/>

</xml_diff>

<commit_message>
Date: 22 Apr 2026
</commit_message>
<xml_diff>
--- a/Assignment_SA2601010.docx
+++ b/Assignment_SA2601010.docx
@@ -3350,6 +3350,8 @@
           <w:t>https://automationexercise.com/test_cases</w:t>
         </w:r>
       </w:hyperlink>
+      <w:bookmarkStart w:id="0" w:name="_GoBack"/>
+      <w:bookmarkEnd w:id="0"/>
     </w:p>
     <w:p>
       <w:pPr>
@@ -4042,11 +4044,682 @@
         <w:rPr>
           <w:sz w:val="24"/>
           <w:szCs w:val="22"/>
-          <w:lang w:val="en-US"/>
-        </w:rPr>
-      </w:pPr>
-      <w:bookmarkStart w:id="0" w:name="_GoBack"/>
-      <w:bookmarkEnd w:id="0"/>
+          <w:highlight w:val="yellow"/>
+          <w:lang w:val="en-US"/>
+        </w:rPr>
+      </w:pPr>
+      <w:r>
+        <w:rPr>
+          <w:sz w:val="24"/>
+          <w:szCs w:val="22"/>
+          <w:highlight w:val="yellow"/>
+          <w:lang w:val="en-US"/>
+        </w:rPr>
+        <w:t xml:space="preserve">Launch </w:t>
+      </w:r>
+      <w:hyperlink r:id="rId30" w:history="1">
+        <w:r>
+          <w:rPr>
+            <w:rStyle w:val="Hyperlink"/>
+            <w:sz w:val="24"/>
+            <w:szCs w:val="22"/>
+            <w:highlight w:val="yellow"/>
+            <w:lang w:val="en-US"/>
+          </w:rPr>
+          <w:t>http://sampleapp.tricentis.com/101/index.php</w:t>
+        </w:r>
+      </w:hyperlink>
+    </w:p>
+    <w:p>
+      <w:pPr>
+        <w:pStyle w:val="ListParagraph"/>
+        <w:numPr>
+          <w:ilvl w:val="1"/>
+          <w:numId w:val="1"/>
+        </w:numPr>
+        <w:rPr>
+          <w:sz w:val="24"/>
+          <w:szCs w:val="22"/>
+          <w:highlight w:val="yellow"/>
+          <w:lang w:val="en-US"/>
+        </w:rPr>
+      </w:pPr>
+      <w:r>
+        <w:rPr>
+          <w:sz w:val="24"/>
+          <w:szCs w:val="22"/>
+          <w:highlight w:val="yellow"/>
+          <w:lang w:val="en-US"/>
+        </w:rPr>
+        <w:t>Click on Automobile link</w:t>
+      </w:r>
+    </w:p>
+    <w:p>
+      <w:pPr>
+        <w:pStyle w:val="ListParagraph"/>
+        <w:numPr>
+          <w:ilvl w:val="1"/>
+          <w:numId w:val="1"/>
+        </w:numPr>
+        <w:rPr>
+          <w:sz w:val="24"/>
+          <w:szCs w:val="22"/>
+          <w:highlight w:val="yellow"/>
+          <w:lang w:val="en-US"/>
+        </w:rPr>
+      </w:pPr>
+      <w:r>
+        <w:rPr>
+          <w:sz w:val="24"/>
+          <w:szCs w:val="22"/>
+          <w:highlight w:val="yellow"/>
+          <w:lang w:val="en-US"/>
+        </w:rPr>
+        <w:t>Click on Enter Insurant Data</w:t>
+      </w:r>
+    </w:p>
+    <w:p>
+      <w:pPr>
+        <w:pStyle w:val="ListParagraph"/>
+        <w:numPr>
+          <w:ilvl w:val="1"/>
+          <w:numId w:val="1"/>
+        </w:numPr>
+        <w:rPr>
+          <w:sz w:val="24"/>
+          <w:szCs w:val="22"/>
+          <w:lang w:val="en-US"/>
+        </w:rPr>
+      </w:pPr>
+      <w:r>
+        <w:rPr>
+          <w:sz w:val="24"/>
+          <w:szCs w:val="22"/>
+          <w:highlight w:val="yellow"/>
+          <w:lang w:val="en-US"/>
+        </w:rPr>
+        <w:t>Upload your picture</w:t>
+      </w:r>
+    </w:p>
+    <w:p>
+      <w:pPr>
+        <w:rPr>
+          <w:sz w:val="24"/>
+          <w:szCs w:val="22"/>
+          <w:lang w:val="en-US"/>
+        </w:rPr>
+      </w:pPr>
+    </w:p>
+    <w:p>
+      <w:pPr>
+        <w:rPr>
+          <w:sz w:val="24"/>
+          <w:szCs w:val="22"/>
+          <w:lang w:val="en-US"/>
+        </w:rPr>
+      </w:pPr>
+      <w:r>
+        <w:rPr>
+          <w:sz w:val="24"/>
+          <w:szCs w:val="22"/>
+          <w:lang w:val="en-US"/>
+        </w:rPr>
+        <w:t>Date: 22 April 2026</w:t>
+      </w:r>
+    </w:p>
+    <w:p>
+      <w:pPr>
+        <w:rPr>
+          <w:sz w:val="24"/>
+          <w:szCs w:val="22"/>
+          <w:lang w:val="en-US"/>
+        </w:rPr>
+      </w:pPr>
+    </w:p>
+    <w:p>
+      <w:pPr>
+        <w:pStyle w:val="ListParagraph"/>
+        <w:numPr>
+          <w:ilvl w:val="0"/>
+          <w:numId w:val="1"/>
+        </w:numPr>
+        <w:rPr>
+          <w:sz w:val="24"/>
+          <w:szCs w:val="22"/>
+          <w:lang w:val="en-US"/>
+        </w:rPr>
+      </w:pPr>
+      <w:r>
+        <w:rPr>
+          <w:sz w:val="24"/>
+          <w:szCs w:val="22"/>
+          <w:lang w:val="en-US"/>
+        </w:rPr>
+        <w:t xml:space="preserve">What is difference between </w:t>
+      </w:r>
+      <w:proofErr w:type="spellStart"/>
+      <w:proofErr w:type="gramStart"/>
+      <w:r>
+        <w:rPr>
+          <w:sz w:val="24"/>
+          <w:szCs w:val="22"/>
+          <w:lang w:val="en-US"/>
+        </w:rPr>
+        <w:t>driver.get</w:t>
+      </w:r>
+      <w:proofErr w:type="spellEnd"/>
+      <w:r>
+        <w:rPr>
+          <w:sz w:val="24"/>
+          <w:szCs w:val="22"/>
+          <w:lang w:val="en-US"/>
+        </w:rPr>
+        <w:t>(</w:t>
+      </w:r>
+      <w:proofErr w:type="gramEnd"/>
+      <w:r>
+        <w:rPr>
+          <w:sz w:val="24"/>
+          <w:szCs w:val="22"/>
+          <w:lang w:val="en-US"/>
+        </w:rPr>
+        <w:t xml:space="preserve">) &amp; </w:t>
+      </w:r>
+      <w:proofErr w:type="spellStart"/>
+      <w:r>
+        <w:rPr>
+          <w:sz w:val="24"/>
+          <w:szCs w:val="22"/>
+          <w:lang w:val="en-US"/>
+        </w:rPr>
+        <w:t>driver.navigate</w:t>
+      </w:r>
+      <w:proofErr w:type="spellEnd"/>
+      <w:r>
+        <w:rPr>
+          <w:sz w:val="24"/>
+          <w:szCs w:val="22"/>
+          <w:lang w:val="en-US"/>
+        </w:rPr>
+        <w:t>().to() method?</w:t>
+      </w:r>
+    </w:p>
+    <w:p>
+      <w:pPr>
+        <w:pStyle w:val="ListParagraph"/>
+        <w:numPr>
+          <w:ilvl w:val="0"/>
+          <w:numId w:val="1"/>
+        </w:numPr>
+        <w:rPr>
+          <w:sz w:val="24"/>
+          <w:szCs w:val="22"/>
+          <w:highlight w:val="yellow"/>
+          <w:lang w:val="en-US"/>
+        </w:rPr>
+      </w:pPr>
+      <w:r>
+        <w:rPr>
+          <w:sz w:val="24"/>
+          <w:szCs w:val="22"/>
+          <w:highlight w:val="yellow"/>
+          <w:lang w:val="en-US"/>
+        </w:rPr>
+        <w:t xml:space="preserve">Launch </w:t>
+      </w:r>
+      <w:hyperlink r:id="rId31" w:history="1">
+        <w:r>
+          <w:rPr>
+            <w:rStyle w:val="Hyperlink"/>
+            <w:sz w:val="24"/>
+            <w:szCs w:val="22"/>
+            <w:highlight w:val="yellow"/>
+            <w:lang w:val="en-US"/>
+          </w:rPr>
+          <w:t>https://www.w3schools.com/tags/tryit.asp?filename=tryhtml_input_disabled</w:t>
+        </w:r>
+      </w:hyperlink>
+    </w:p>
+    <w:p>
+      <w:pPr>
+        <w:pStyle w:val="ListParagraph"/>
+        <w:numPr>
+          <w:ilvl w:val="1"/>
+          <w:numId w:val="1"/>
+        </w:numPr>
+        <w:rPr>
+          <w:sz w:val="24"/>
+          <w:szCs w:val="22"/>
+          <w:highlight w:val="yellow"/>
+          <w:lang w:val="en-US"/>
+        </w:rPr>
+      </w:pPr>
+      <w:r>
+        <w:rPr>
+          <w:sz w:val="24"/>
+          <w:szCs w:val="22"/>
+          <w:highlight w:val="yellow"/>
+          <w:lang w:val="en-US"/>
+        </w:rPr>
+        <w:t>Enter First Name in the text box</w:t>
+      </w:r>
+    </w:p>
+    <w:p>
+      <w:pPr>
+        <w:pStyle w:val="ListParagraph"/>
+        <w:numPr>
+          <w:ilvl w:val="0"/>
+          <w:numId w:val="1"/>
+        </w:numPr>
+        <w:spacing w:line="252" w:lineRule="auto"/>
+        <w:rPr>
+          <w:sz w:val="24"/>
+          <w:szCs w:val="24"/>
+          <w:lang w:val="en-US"/>
+        </w:rPr>
+      </w:pPr>
+      <w:r>
+        <w:rPr>
+          <w:sz w:val="24"/>
+          <w:szCs w:val="24"/>
+          <w:lang w:val="en-US"/>
+        </w:rPr>
+        <w:t xml:space="preserve">Open </w:t>
+      </w:r>
+      <w:hyperlink r:id="rId32" w:history="1">
+        <w:r>
+          <w:rPr>
+            <w:rStyle w:val="Hyperlink"/>
+            <w:sz w:val="24"/>
+            <w:szCs w:val="24"/>
+            <w:lang w:val="en-US"/>
+          </w:rPr>
+          <w:t>https://omayo.blogspot.com/</w:t>
+        </w:r>
+      </w:hyperlink>
+    </w:p>
+    <w:p>
+      <w:pPr>
+        <w:pStyle w:val="ListParagraph"/>
+        <w:numPr>
+          <w:ilvl w:val="1"/>
+          <w:numId w:val="1"/>
+        </w:numPr>
+        <w:spacing w:line="252" w:lineRule="auto"/>
+        <w:rPr>
+          <w:sz w:val="24"/>
+          <w:szCs w:val="24"/>
+          <w:lang w:val="en-US"/>
+        </w:rPr>
+      </w:pPr>
+      <w:r>
+        <w:rPr>
+          <w:sz w:val="24"/>
+          <w:szCs w:val="24"/>
+          <w:lang w:val="en-US"/>
+        </w:rPr>
+        <w:t xml:space="preserve">Click on </w:t>
+      </w:r>
+      <w:proofErr w:type="spellStart"/>
+      <w:r>
+        <w:rPr>
+          <w:sz w:val="24"/>
+          <w:szCs w:val="24"/>
+          <w:lang w:val="en-US"/>
+        </w:rPr>
+        <w:t>ClickToGetAlert</w:t>
+      </w:r>
+      <w:proofErr w:type="spellEnd"/>
+      <w:r>
+        <w:rPr>
+          <w:sz w:val="24"/>
+          <w:szCs w:val="24"/>
+          <w:lang w:val="en-US"/>
+        </w:rPr>
+        <w:t xml:space="preserve"> button</w:t>
+      </w:r>
+    </w:p>
+    <w:p>
+      <w:pPr>
+        <w:pStyle w:val="ListParagraph"/>
+        <w:numPr>
+          <w:ilvl w:val="1"/>
+          <w:numId w:val="1"/>
+        </w:numPr>
+        <w:spacing w:line="252" w:lineRule="auto"/>
+        <w:rPr>
+          <w:sz w:val="24"/>
+          <w:szCs w:val="24"/>
+          <w:lang w:val="en-US"/>
+        </w:rPr>
+      </w:pPr>
+      <w:r>
+        <w:rPr>
+          <w:sz w:val="24"/>
+          <w:szCs w:val="24"/>
+          <w:lang w:val="en-US"/>
+        </w:rPr>
+        <w:t>Display the text on alert</w:t>
+      </w:r>
+    </w:p>
+    <w:p>
+      <w:pPr>
+        <w:pStyle w:val="ListParagraph"/>
+        <w:numPr>
+          <w:ilvl w:val="1"/>
+          <w:numId w:val="1"/>
+        </w:numPr>
+        <w:spacing w:line="252" w:lineRule="auto"/>
+        <w:rPr>
+          <w:sz w:val="24"/>
+          <w:szCs w:val="24"/>
+          <w:lang w:val="en-US"/>
+        </w:rPr>
+      </w:pPr>
+      <w:r>
+        <w:rPr>
+          <w:sz w:val="24"/>
+          <w:szCs w:val="24"/>
+          <w:lang w:val="en-US"/>
+        </w:rPr>
+        <w:t>Click on Ok button</w:t>
+      </w:r>
+    </w:p>
+    <w:p>
+      <w:pPr>
+        <w:pStyle w:val="ListParagraph"/>
+        <w:numPr>
+          <w:ilvl w:val="1"/>
+          <w:numId w:val="1"/>
+        </w:numPr>
+        <w:spacing w:line="252" w:lineRule="auto"/>
+        <w:rPr>
+          <w:sz w:val="24"/>
+          <w:szCs w:val="24"/>
+          <w:lang w:val="en-US"/>
+        </w:rPr>
+      </w:pPr>
+      <w:r>
+        <w:rPr>
+          <w:sz w:val="24"/>
+          <w:szCs w:val="24"/>
+          <w:lang w:val="en-US"/>
+        </w:rPr>
+        <w:t xml:space="preserve">Click on </w:t>
+      </w:r>
+      <w:proofErr w:type="spellStart"/>
+      <w:r>
+        <w:rPr>
+          <w:sz w:val="24"/>
+          <w:szCs w:val="24"/>
+          <w:lang w:val="en-US"/>
+        </w:rPr>
+        <w:t>GetPrompt</w:t>
+      </w:r>
+      <w:proofErr w:type="spellEnd"/>
+      <w:r>
+        <w:rPr>
+          <w:sz w:val="24"/>
+          <w:szCs w:val="24"/>
+          <w:lang w:val="en-US"/>
+        </w:rPr>
+        <w:t xml:space="preserve"> Button</w:t>
+      </w:r>
+    </w:p>
+    <w:p>
+      <w:pPr>
+        <w:pStyle w:val="ListParagraph"/>
+        <w:numPr>
+          <w:ilvl w:val="1"/>
+          <w:numId w:val="1"/>
+        </w:numPr>
+        <w:spacing w:line="252" w:lineRule="auto"/>
+        <w:rPr>
+          <w:sz w:val="24"/>
+          <w:szCs w:val="24"/>
+          <w:lang w:val="en-US"/>
+        </w:rPr>
+      </w:pPr>
+      <w:r>
+        <w:rPr>
+          <w:sz w:val="24"/>
+          <w:szCs w:val="24"/>
+          <w:lang w:val="en-US"/>
+        </w:rPr>
+        <w:t xml:space="preserve">Enter your name </w:t>
+      </w:r>
+    </w:p>
+    <w:p>
+      <w:pPr>
+        <w:pStyle w:val="ListParagraph"/>
+        <w:numPr>
+          <w:ilvl w:val="1"/>
+          <w:numId w:val="1"/>
+        </w:numPr>
+        <w:spacing w:line="252" w:lineRule="auto"/>
+        <w:rPr>
+          <w:sz w:val="24"/>
+          <w:szCs w:val="24"/>
+          <w:lang w:val="en-US"/>
+        </w:rPr>
+      </w:pPr>
+      <w:r>
+        <w:rPr>
+          <w:sz w:val="24"/>
+          <w:szCs w:val="24"/>
+          <w:lang w:val="en-US"/>
+        </w:rPr>
+        <w:t>Click on Ok button</w:t>
+      </w:r>
+    </w:p>
+    <w:p>
+      <w:pPr>
+        <w:pStyle w:val="ListParagraph"/>
+        <w:numPr>
+          <w:ilvl w:val="1"/>
+          <w:numId w:val="1"/>
+        </w:numPr>
+        <w:spacing w:line="252" w:lineRule="auto"/>
+        <w:rPr>
+          <w:sz w:val="24"/>
+          <w:szCs w:val="24"/>
+          <w:lang w:val="en-US"/>
+        </w:rPr>
+      </w:pPr>
+      <w:r>
+        <w:rPr>
+          <w:sz w:val="24"/>
+          <w:szCs w:val="24"/>
+          <w:lang w:val="en-US"/>
+        </w:rPr>
+        <w:t xml:space="preserve">Click on </w:t>
+      </w:r>
+      <w:proofErr w:type="spellStart"/>
+      <w:r>
+        <w:rPr>
+          <w:sz w:val="24"/>
+          <w:szCs w:val="24"/>
+          <w:lang w:val="en-US"/>
+        </w:rPr>
+        <w:t>GetConfirmation</w:t>
+      </w:r>
+      <w:proofErr w:type="spellEnd"/>
+      <w:r>
+        <w:rPr>
+          <w:sz w:val="24"/>
+          <w:szCs w:val="24"/>
+          <w:lang w:val="en-US"/>
+        </w:rPr>
+        <w:t xml:space="preserve"> Button </w:t>
+      </w:r>
+    </w:p>
+    <w:p>
+      <w:pPr>
+        <w:pStyle w:val="ListParagraph"/>
+        <w:numPr>
+          <w:ilvl w:val="1"/>
+          <w:numId w:val="1"/>
+        </w:numPr>
+        <w:rPr>
+          <w:sz w:val="24"/>
+          <w:szCs w:val="22"/>
+          <w:lang w:val="en-US"/>
+        </w:rPr>
+      </w:pPr>
+      <w:r>
+        <w:rPr>
+          <w:sz w:val="24"/>
+          <w:szCs w:val="24"/>
+          <w:lang w:val="en-US"/>
+        </w:rPr>
+        <w:t>Click on Cancel button</w:t>
+      </w:r>
+    </w:p>
+    <w:p>
+      <w:pPr>
+        <w:pStyle w:val="ListParagraph"/>
+        <w:numPr>
+          <w:ilvl w:val="0"/>
+          <w:numId w:val="1"/>
+        </w:numPr>
+        <w:rPr>
+          <w:sz w:val="24"/>
+          <w:szCs w:val="22"/>
+          <w:lang w:val="en-US"/>
+        </w:rPr>
+      </w:pPr>
+      <w:r>
+        <w:rPr>
+          <w:sz w:val="24"/>
+          <w:szCs w:val="22"/>
+          <w:lang w:val="en-US"/>
+        </w:rPr>
+        <w:t xml:space="preserve">Open </w:t>
+      </w:r>
+      <w:hyperlink r:id="rId33" w:history="1">
+        <w:r>
+          <w:rPr>
+            <w:rStyle w:val="Hyperlink"/>
+            <w:sz w:val="24"/>
+            <w:szCs w:val="22"/>
+            <w:lang w:val="en-US"/>
+          </w:rPr>
+          <w:t>https://testautomationpractice.blogspot.com/?m=1</w:t>
+        </w:r>
+      </w:hyperlink>
+    </w:p>
+    <w:p>
+      <w:pPr>
+        <w:pStyle w:val="ListParagraph"/>
+        <w:numPr>
+          <w:ilvl w:val="1"/>
+          <w:numId w:val="1"/>
+        </w:numPr>
+        <w:rPr>
+          <w:sz w:val="24"/>
+          <w:szCs w:val="22"/>
+          <w:lang w:val="en-US"/>
+        </w:rPr>
+      </w:pPr>
+      <w:r>
+        <w:rPr>
+          <w:sz w:val="24"/>
+          <w:szCs w:val="22"/>
+          <w:lang w:val="en-US"/>
+        </w:rPr>
+        <w:t>Scroll till Upload Multiple File Control</w:t>
+      </w:r>
+    </w:p>
+    <w:p>
+      <w:pPr>
+        <w:pStyle w:val="ListParagraph"/>
+        <w:numPr>
+          <w:ilvl w:val="1"/>
+          <w:numId w:val="1"/>
+        </w:numPr>
+        <w:rPr>
+          <w:sz w:val="24"/>
+          <w:szCs w:val="22"/>
+          <w:lang w:val="en-US"/>
+        </w:rPr>
+      </w:pPr>
+      <w:r>
+        <w:rPr>
+          <w:sz w:val="24"/>
+          <w:szCs w:val="22"/>
+          <w:lang w:val="en-US"/>
+        </w:rPr>
+        <w:t>Upload any 2 file</w:t>
+      </w:r>
+    </w:p>
+    <w:p>
+      <w:pPr>
+        <w:pStyle w:val="ListParagraph"/>
+        <w:numPr>
+          <w:ilvl w:val="0"/>
+          <w:numId w:val="1"/>
+        </w:numPr>
+        <w:rPr>
+          <w:sz w:val="24"/>
+          <w:szCs w:val="22"/>
+          <w:lang w:val="en-US"/>
+        </w:rPr>
+      </w:pPr>
+      <w:r>
+        <w:rPr>
+          <w:sz w:val="24"/>
+          <w:szCs w:val="22"/>
+          <w:lang w:val="en-US"/>
+        </w:rPr>
+        <w:t xml:space="preserve">Open </w:t>
+      </w:r>
+      <w:hyperlink r:id="rId34" w:history="1">
+        <w:r>
+          <w:rPr>
+            <w:rStyle w:val="Hyperlink"/>
+            <w:sz w:val="24"/>
+            <w:szCs w:val="22"/>
+            <w:lang w:val="en-US"/>
+          </w:rPr>
+          <w:t>https://istqb.in/</w:t>
+        </w:r>
+      </w:hyperlink>
+    </w:p>
+    <w:p>
+      <w:pPr>
+        <w:pStyle w:val="ListParagraph"/>
+        <w:numPr>
+          <w:ilvl w:val="1"/>
+          <w:numId w:val="1"/>
+        </w:numPr>
+        <w:rPr>
+          <w:sz w:val="24"/>
+          <w:szCs w:val="22"/>
+          <w:lang w:val="en-US"/>
+        </w:rPr>
+      </w:pPr>
+      <w:r>
+        <w:rPr>
+          <w:sz w:val="24"/>
+          <w:szCs w:val="22"/>
+          <w:lang w:val="en-US"/>
+        </w:rPr>
+        <w:t>Display all 8 menus</w:t>
+      </w:r>
+    </w:p>
+    <w:p>
+      <w:pPr>
+        <w:pStyle w:val="ListParagraph"/>
+        <w:numPr>
+          <w:ilvl w:val="1"/>
+          <w:numId w:val="1"/>
+        </w:numPr>
+        <w:rPr>
+          <w:sz w:val="24"/>
+          <w:szCs w:val="22"/>
+          <w:lang w:val="en-US"/>
+        </w:rPr>
+      </w:pPr>
       <w:r>
         <w:rPr>
           <w:sz w:val="24"/>

</xml_diff>

<commit_message>
Date: 23 Apr 2026
</commit_message>
<xml_diff>
--- a/Assignment_SA2601010.docx
+++ b/Assignment_SA2601010.docx
@@ -3350,8 +3350,6 @@
           <w:t>https://automationexercise.com/test_cases</w:t>
         </w:r>
       </w:hyperlink>
-      <w:bookmarkStart w:id="0" w:name="_GoBack"/>
-      <w:bookmarkEnd w:id="0"/>
     </w:p>
     <w:p>
       <w:pPr>
@@ -4709,23 +4707,292 @@
     </w:p>
     <w:p>
       <w:pPr>
-        <w:pStyle w:val="ListParagraph"/>
-        <w:numPr>
-          <w:ilvl w:val="1"/>
-          <w:numId w:val="1"/>
-        </w:numPr>
-        <w:rPr>
-          <w:sz w:val="24"/>
-          <w:szCs w:val="22"/>
-          <w:lang w:val="en-US"/>
-        </w:rPr>
-      </w:pPr>
-      <w:r>
-        <w:rPr>
-          <w:sz w:val="24"/>
-          <w:szCs w:val="22"/>
-          <w:lang w:val="en-US"/>
-        </w:rPr>
+        <w:rPr>
+          <w:sz w:val="24"/>
+          <w:szCs w:val="22"/>
+          <w:lang w:val="en-US"/>
+        </w:rPr>
+      </w:pPr>
+    </w:p>
+    <w:p>
+      <w:pPr>
+        <w:rPr>
+          <w:sz w:val="24"/>
+          <w:szCs w:val="22"/>
+          <w:lang w:val="en-US"/>
+        </w:rPr>
+      </w:pPr>
+      <w:r>
+        <w:rPr>
+          <w:sz w:val="24"/>
+          <w:szCs w:val="22"/>
+          <w:lang w:val="en-US"/>
+        </w:rPr>
+        <w:t>Date: 23 April 2026</w:t>
+      </w:r>
+    </w:p>
+    <w:p>
+      <w:pPr>
+        <w:rPr>
+          <w:sz w:val="24"/>
+          <w:szCs w:val="22"/>
+          <w:lang w:val="en-US"/>
+        </w:rPr>
+      </w:pPr>
+    </w:p>
+    <w:p>
+      <w:pPr>
+        <w:pStyle w:val="ListParagraph"/>
+        <w:numPr>
+          <w:ilvl w:val="0"/>
+          <w:numId w:val="1"/>
+        </w:numPr>
+        <w:rPr>
+          <w:sz w:val="24"/>
+          <w:szCs w:val="22"/>
+          <w:lang w:val="en-US"/>
+        </w:rPr>
+      </w:pPr>
+      <w:r>
+        <w:rPr>
+          <w:sz w:val="24"/>
+          <w:szCs w:val="22"/>
+          <w:lang w:val="en-US"/>
+        </w:rPr>
+        <w:t xml:space="preserve">Launch </w:t>
+      </w:r>
+      <w:hyperlink r:id="rId35" w:history="1">
+        <w:r>
+          <w:rPr>
+            <w:rStyle w:val="Hyperlink"/>
+            <w:sz w:val="24"/>
+            <w:szCs w:val="22"/>
+            <w:lang w:val="en-US"/>
+          </w:rPr>
+          <w:t>https://opensource-demo.orangehrmlive.com/web/index.php/auth/login</w:t>
+        </w:r>
+      </w:hyperlink>
+    </w:p>
+    <w:p>
+      <w:pPr>
+        <w:pStyle w:val="ListParagraph"/>
+        <w:numPr>
+          <w:ilvl w:val="1"/>
+          <w:numId w:val="1"/>
+        </w:numPr>
+        <w:rPr>
+          <w:sz w:val="24"/>
+          <w:szCs w:val="22"/>
+          <w:lang w:val="en-US"/>
+        </w:rPr>
+      </w:pPr>
+      <w:r>
+        <w:rPr>
+          <w:sz w:val="24"/>
+          <w:szCs w:val="22"/>
+          <w:lang w:val="en-US"/>
+        </w:rPr>
+        <w:t>Enter user name as admin</w:t>
+      </w:r>
+    </w:p>
+    <w:p>
+      <w:pPr>
+        <w:pStyle w:val="ListParagraph"/>
+        <w:numPr>
+          <w:ilvl w:val="1"/>
+          <w:numId w:val="1"/>
+        </w:numPr>
+        <w:rPr>
+          <w:sz w:val="24"/>
+          <w:szCs w:val="22"/>
+          <w:lang w:val="en-US"/>
+        </w:rPr>
+      </w:pPr>
+      <w:r>
+        <w:rPr>
+          <w:sz w:val="24"/>
+          <w:szCs w:val="22"/>
+          <w:lang w:val="en-US"/>
+        </w:rPr>
+        <w:t>Enter password as admin123</w:t>
+      </w:r>
+    </w:p>
+    <w:p>
+      <w:pPr>
+        <w:pStyle w:val="ListParagraph"/>
+        <w:numPr>
+          <w:ilvl w:val="1"/>
+          <w:numId w:val="1"/>
+        </w:numPr>
+        <w:rPr>
+          <w:sz w:val="24"/>
+          <w:szCs w:val="22"/>
+          <w:lang w:val="en-US"/>
+        </w:rPr>
+      </w:pPr>
+      <w:r>
+        <w:rPr>
+          <w:sz w:val="24"/>
+          <w:szCs w:val="22"/>
+          <w:lang w:val="en-US"/>
+        </w:rPr>
+        <w:t>Click on Login button</w:t>
+      </w:r>
+    </w:p>
+    <w:p>
+      <w:pPr>
+        <w:pStyle w:val="ListParagraph"/>
+        <w:numPr>
+          <w:ilvl w:val="1"/>
+          <w:numId w:val="1"/>
+        </w:numPr>
+        <w:rPr>
+          <w:sz w:val="24"/>
+          <w:szCs w:val="22"/>
+          <w:lang w:val="en-US"/>
+        </w:rPr>
+      </w:pPr>
+      <w:r>
+        <w:rPr>
+          <w:sz w:val="24"/>
+          <w:szCs w:val="22"/>
+          <w:lang w:val="en-US"/>
+        </w:rPr>
+        <w:t>Click on My Info</w:t>
+      </w:r>
+    </w:p>
+    <w:p>
+      <w:pPr>
+        <w:pStyle w:val="ListParagraph"/>
+        <w:numPr>
+          <w:ilvl w:val="1"/>
+          <w:numId w:val="1"/>
+        </w:numPr>
+        <w:rPr>
+          <w:sz w:val="24"/>
+          <w:szCs w:val="22"/>
+          <w:lang w:val="en-US"/>
+        </w:rPr>
+      </w:pPr>
+      <w:r>
+        <w:rPr>
+          <w:sz w:val="24"/>
+          <w:szCs w:val="22"/>
+          <w:lang w:val="en-US"/>
+        </w:rPr>
+        <w:t>Click on Image of User</w:t>
+      </w:r>
+    </w:p>
+    <w:p>
+      <w:pPr>
+        <w:pStyle w:val="ListParagraph"/>
+        <w:numPr>
+          <w:ilvl w:val="1"/>
+          <w:numId w:val="1"/>
+        </w:numPr>
+        <w:rPr>
+          <w:sz w:val="24"/>
+          <w:szCs w:val="22"/>
+          <w:lang w:val="en-US"/>
+        </w:rPr>
+      </w:pPr>
+      <w:r>
+        <w:rPr>
+          <w:sz w:val="24"/>
+          <w:szCs w:val="22"/>
+          <w:lang w:val="en-US"/>
+        </w:rPr>
+        <w:t>Click on + button to change the image</w:t>
+      </w:r>
+    </w:p>
+    <w:p>
+      <w:pPr>
+        <w:pStyle w:val="ListParagraph"/>
+        <w:numPr>
+          <w:ilvl w:val="1"/>
+          <w:numId w:val="1"/>
+        </w:numPr>
+        <w:rPr>
+          <w:sz w:val="24"/>
+          <w:szCs w:val="22"/>
+          <w:lang w:val="en-US"/>
+        </w:rPr>
+      </w:pPr>
+      <w:r>
+        <w:rPr>
+          <w:sz w:val="24"/>
+          <w:szCs w:val="22"/>
+          <w:lang w:val="en-US"/>
+        </w:rPr>
+        <w:t>Upload your picture (using Robot class)</w:t>
+      </w:r>
+    </w:p>
+    <w:p>
+      <w:pPr>
+        <w:pStyle w:val="ListParagraph"/>
+        <w:numPr>
+          <w:ilvl w:val="1"/>
+          <w:numId w:val="1"/>
+        </w:numPr>
+        <w:rPr>
+          <w:sz w:val="24"/>
+          <w:szCs w:val="22"/>
+          <w:lang w:val="en-US"/>
+        </w:rPr>
+      </w:pPr>
+      <w:r>
+        <w:rPr>
+          <w:sz w:val="24"/>
+          <w:szCs w:val="22"/>
+          <w:lang w:val="en-US"/>
+        </w:rPr>
+        <w:t>Click on Save button</w:t>
+      </w:r>
+    </w:p>
+    <w:p>
+      <w:pPr>
+        <w:pStyle w:val="ListParagraph"/>
+        <w:numPr>
+          <w:ilvl w:val="1"/>
+          <w:numId w:val="1"/>
+        </w:numPr>
+        <w:rPr>
+          <w:sz w:val="24"/>
+          <w:szCs w:val="22"/>
+          <w:lang w:val="en-US"/>
+        </w:rPr>
+      </w:pPr>
+      <w:r>
+        <w:rPr>
+          <w:sz w:val="24"/>
+          <w:szCs w:val="22"/>
+          <w:lang w:val="en-US"/>
+        </w:rPr>
+        <w:t>Logout</w:t>
+      </w:r>
+    </w:p>
+    <w:p>
+      <w:pPr>
+        <w:pStyle w:val="ListParagraph"/>
+        <w:numPr>
+          <w:ilvl w:val="1"/>
+          <w:numId w:val="1"/>
+        </w:numPr>
+        <w:rPr>
+          <w:sz w:val="24"/>
+          <w:szCs w:val="22"/>
+          <w:lang w:val="en-US"/>
+        </w:rPr>
+      </w:pPr>
+      <w:bookmarkStart w:id="0" w:name="_GoBack"/>
+      <w:bookmarkEnd w:id="0"/>
+      <w:r>
+        <w:rPr>
+          <w:sz w:val="24"/>
+          <w:szCs w:val="22"/>
+          <w:lang w:val="en-US"/>
+        </w:rPr>
+        <w:lastRenderedPageBreak/>
         <w:br/>
       </w:r>
     </w:p>

</xml_diff>

<commit_message>
Date: 30 Apr 2026
</commit_message>
<xml_diff>
--- a/Assignment_SA2601010.docx
+++ b/Assignment_SA2601010.docx
@@ -5790,11 +5790,436 @@
         <w:rPr>
           <w:sz w:val="24"/>
           <w:szCs w:val="22"/>
-          <w:lang w:val="en-US"/>
-        </w:rPr>
-      </w:pPr>
-      <w:bookmarkStart w:id="0" w:name="_GoBack"/>
-      <w:bookmarkEnd w:id="0"/>
+          <w:highlight w:val="yellow"/>
+          <w:lang w:val="en-US"/>
+        </w:rPr>
+      </w:pPr>
+      <w:r>
+        <w:rPr>
+          <w:sz w:val="24"/>
+          <w:szCs w:val="22"/>
+          <w:highlight w:val="yellow"/>
+          <w:lang w:val="en-US"/>
+        </w:rPr>
+        <w:t>Create an Excel file with name LoginData.xlsx with following data</w:t>
+      </w:r>
+      <w:r>
+        <w:rPr>
+          <w:sz w:val="24"/>
+          <w:szCs w:val="22"/>
+          <w:highlight w:val="yellow"/>
+          <w:lang w:val="en-US"/>
+        </w:rPr>
+        <w:br/>
+      </w:r>
+    </w:p>
+    <w:tbl>
+      <w:tblPr>
+        <w:tblStyle w:val="TableGrid"/>
+        <w:tblW w:w="0" w:type="auto"/>
+        <w:tblInd w:w="720" w:type="dxa"/>
+        <w:tblLook w:val="04A0" w:firstRow="1" w:lastRow="0" w:firstColumn="1" w:lastColumn="0" w:noHBand="0" w:noVBand="1"/>
+      </w:tblPr>
+      <w:tblGrid>
+        <w:gridCol w:w="2946"/>
+        <w:gridCol w:w="2734"/>
+        <w:gridCol w:w="2616"/>
+      </w:tblGrid>
+      <w:tr>
+        <w:tc>
+          <w:tcPr>
+            <w:tcW w:w="3005" w:type="dxa"/>
+          </w:tcPr>
+          <w:p>
+            <w:pPr>
+              <w:rPr>
+                <w:sz w:val="24"/>
+                <w:szCs w:val="22"/>
+                <w:highlight w:val="yellow"/>
+                <w:lang w:val="en-US"/>
+              </w:rPr>
+            </w:pPr>
+            <w:r>
+              <w:rPr>
+                <w:sz w:val="24"/>
+                <w:szCs w:val="22"/>
+                <w:highlight w:val="yellow"/>
+                <w:lang w:val="en-US"/>
+              </w:rPr>
+              <w:t>User Name</w:t>
+            </w:r>
+          </w:p>
+        </w:tc>
+        <w:tc>
+          <w:tcPr>
+            <w:tcW w:w="3005" w:type="dxa"/>
+          </w:tcPr>
+          <w:p>
+            <w:pPr>
+              <w:rPr>
+                <w:sz w:val="24"/>
+                <w:szCs w:val="22"/>
+                <w:highlight w:val="yellow"/>
+                <w:lang w:val="en-US"/>
+              </w:rPr>
+            </w:pPr>
+            <w:r>
+              <w:rPr>
+                <w:sz w:val="24"/>
+                <w:szCs w:val="22"/>
+                <w:highlight w:val="yellow"/>
+                <w:lang w:val="en-US"/>
+              </w:rPr>
+              <w:t>Password</w:t>
+            </w:r>
+          </w:p>
+        </w:tc>
+        <w:tc>
+          <w:tcPr>
+            <w:tcW w:w="3006" w:type="dxa"/>
+          </w:tcPr>
+          <w:p>
+            <w:pPr>
+              <w:rPr>
+                <w:sz w:val="24"/>
+                <w:szCs w:val="22"/>
+                <w:highlight w:val="yellow"/>
+                <w:lang w:val="en-US"/>
+              </w:rPr>
+            </w:pPr>
+            <w:r>
+              <w:rPr>
+                <w:sz w:val="24"/>
+                <w:szCs w:val="22"/>
+                <w:highlight w:val="yellow"/>
+                <w:lang w:val="en-US"/>
+              </w:rPr>
+              <w:t>Result</w:t>
+            </w:r>
+          </w:p>
+        </w:tc>
+      </w:tr>
+      <w:tr>
+        <w:tc>
+          <w:tcPr>
+            <w:tcW w:w="3005" w:type="dxa"/>
+          </w:tcPr>
+          <w:p>
+            <w:pPr>
+              <w:rPr>
+                <w:sz w:val="24"/>
+                <w:szCs w:val="22"/>
+                <w:highlight w:val="yellow"/>
+                <w:lang w:val="en-US"/>
+              </w:rPr>
+            </w:pPr>
+            <w:proofErr w:type="spellStart"/>
+            <w:r>
+              <w:rPr>
+                <w:sz w:val="24"/>
+                <w:szCs w:val="22"/>
+                <w:highlight w:val="yellow"/>
+                <w:lang w:val="en-US"/>
+              </w:rPr>
+              <w:t>performance_glitch_user</w:t>
+            </w:r>
+            <w:proofErr w:type="spellEnd"/>
+          </w:p>
+        </w:tc>
+        <w:tc>
+          <w:tcPr>
+            <w:tcW w:w="3005" w:type="dxa"/>
+          </w:tcPr>
+          <w:p>
+            <w:pPr>
+              <w:rPr>
+                <w:sz w:val="24"/>
+                <w:szCs w:val="22"/>
+                <w:highlight w:val="yellow"/>
+                <w:lang w:val="en-US"/>
+              </w:rPr>
+            </w:pPr>
+            <w:proofErr w:type="spellStart"/>
+            <w:r>
+              <w:rPr>
+                <w:sz w:val="24"/>
+                <w:szCs w:val="22"/>
+                <w:highlight w:val="yellow"/>
+                <w:lang w:val="en-US"/>
+              </w:rPr>
+              <w:t>secret_sauce</w:t>
+            </w:r>
+            <w:proofErr w:type="spellEnd"/>
+          </w:p>
+        </w:tc>
+        <w:tc>
+          <w:tcPr>
+            <w:tcW w:w="3006" w:type="dxa"/>
+          </w:tcPr>
+          <w:p>
+            <w:pPr>
+              <w:rPr>
+                <w:sz w:val="24"/>
+                <w:szCs w:val="22"/>
+                <w:highlight w:val="yellow"/>
+                <w:lang w:val="en-US"/>
+              </w:rPr>
+            </w:pPr>
+            <w:r>
+              <w:rPr>
+                <w:sz w:val="24"/>
+                <w:szCs w:val="22"/>
+                <w:highlight w:val="yellow"/>
+                <w:lang w:val="en-US"/>
+              </w:rPr>
+              <w:t>Not Run</w:t>
+            </w:r>
+          </w:p>
+        </w:tc>
+      </w:tr>
+      <w:tr>
+        <w:tc>
+          <w:tcPr>
+            <w:tcW w:w="3005" w:type="dxa"/>
+          </w:tcPr>
+          <w:p>
+            <w:pPr>
+              <w:rPr>
+                <w:sz w:val="24"/>
+                <w:szCs w:val="22"/>
+                <w:highlight w:val="yellow"/>
+                <w:lang w:val="en-US"/>
+              </w:rPr>
+            </w:pPr>
+            <w:r>
+              <w:rPr>
+                <w:sz w:val="24"/>
+                <w:szCs w:val="22"/>
+                <w:highlight w:val="yellow"/>
+                <w:lang w:val="en-US"/>
+              </w:rPr>
+              <w:t>Pratik</w:t>
+            </w:r>
+          </w:p>
+        </w:tc>
+        <w:tc>
+          <w:tcPr>
+            <w:tcW w:w="3005" w:type="dxa"/>
+          </w:tcPr>
+          <w:p>
+            <w:pPr>
+              <w:rPr>
+                <w:sz w:val="24"/>
+                <w:szCs w:val="22"/>
+                <w:highlight w:val="yellow"/>
+                <w:lang w:val="en-US"/>
+              </w:rPr>
+            </w:pPr>
+            <w:r>
+              <w:rPr>
+                <w:sz w:val="24"/>
+                <w:szCs w:val="22"/>
+                <w:highlight w:val="yellow"/>
+                <w:lang w:val="en-US"/>
+              </w:rPr>
+              <w:t>Pratik123</w:t>
+            </w:r>
+          </w:p>
+        </w:tc>
+        <w:tc>
+          <w:tcPr>
+            <w:tcW w:w="3006" w:type="dxa"/>
+          </w:tcPr>
+          <w:p>
+            <w:pPr>
+              <w:rPr>
+                <w:sz w:val="24"/>
+                <w:szCs w:val="22"/>
+                <w:highlight w:val="yellow"/>
+                <w:lang w:val="en-US"/>
+              </w:rPr>
+            </w:pPr>
+            <w:r>
+              <w:rPr>
+                <w:sz w:val="24"/>
+                <w:szCs w:val="22"/>
+                <w:highlight w:val="yellow"/>
+                <w:lang w:val="en-US"/>
+              </w:rPr>
+              <w:t>Not Run</w:t>
+            </w:r>
+          </w:p>
+        </w:tc>
+      </w:tr>
+      <w:tr>
+        <w:tc>
+          <w:tcPr>
+            <w:tcW w:w="3005" w:type="dxa"/>
+          </w:tcPr>
+          <w:p>
+            <w:pPr>
+              <w:rPr>
+                <w:sz w:val="24"/>
+                <w:szCs w:val="22"/>
+                <w:highlight w:val="yellow"/>
+                <w:lang w:val="en-US"/>
+              </w:rPr>
+            </w:pPr>
+            <w:proofErr w:type="spellStart"/>
+            <w:r>
+              <w:rPr>
+                <w:sz w:val="24"/>
+                <w:szCs w:val="22"/>
+                <w:highlight w:val="yellow"/>
+                <w:lang w:val="en-US"/>
+              </w:rPr>
+              <w:t>standard_user</w:t>
+            </w:r>
+            <w:proofErr w:type="spellEnd"/>
+          </w:p>
+        </w:tc>
+        <w:tc>
+          <w:tcPr>
+            <w:tcW w:w="3005" w:type="dxa"/>
+          </w:tcPr>
+          <w:p>
+            <w:pPr>
+              <w:rPr>
+                <w:sz w:val="24"/>
+                <w:szCs w:val="22"/>
+                <w:highlight w:val="yellow"/>
+                <w:lang w:val="en-US"/>
+              </w:rPr>
+            </w:pPr>
+            <w:proofErr w:type="spellStart"/>
+            <w:r>
+              <w:rPr>
+                <w:sz w:val="24"/>
+                <w:szCs w:val="22"/>
+                <w:highlight w:val="yellow"/>
+                <w:lang w:val="en-US"/>
+              </w:rPr>
+              <w:t>secret_sauce</w:t>
+            </w:r>
+            <w:proofErr w:type="spellEnd"/>
+          </w:p>
+        </w:tc>
+        <w:tc>
+          <w:tcPr>
+            <w:tcW w:w="3006" w:type="dxa"/>
+          </w:tcPr>
+          <w:p>
+            <w:pPr>
+              <w:rPr>
+                <w:sz w:val="24"/>
+                <w:szCs w:val="22"/>
+                <w:highlight w:val="yellow"/>
+                <w:lang w:val="en-US"/>
+              </w:rPr>
+            </w:pPr>
+            <w:r>
+              <w:rPr>
+                <w:sz w:val="24"/>
+                <w:szCs w:val="22"/>
+                <w:highlight w:val="yellow"/>
+                <w:lang w:val="en-US"/>
+              </w:rPr>
+              <w:t>Not Run</w:t>
+            </w:r>
+          </w:p>
+        </w:tc>
+      </w:tr>
+      <w:tr>
+        <w:tc>
+          <w:tcPr>
+            <w:tcW w:w="3005" w:type="dxa"/>
+          </w:tcPr>
+          <w:p>
+            <w:pPr>
+              <w:rPr>
+                <w:sz w:val="24"/>
+                <w:szCs w:val="22"/>
+                <w:highlight w:val="yellow"/>
+                <w:lang w:val="en-US"/>
+              </w:rPr>
+            </w:pPr>
+            <w:proofErr w:type="spellStart"/>
+            <w:r>
+              <w:rPr>
+                <w:sz w:val="24"/>
+                <w:szCs w:val="22"/>
+                <w:highlight w:val="yellow"/>
+                <w:lang w:val="en-US"/>
+              </w:rPr>
+              <w:t>Aniket</w:t>
+            </w:r>
+            <w:proofErr w:type="spellEnd"/>
+          </w:p>
+        </w:tc>
+        <w:tc>
+          <w:tcPr>
+            <w:tcW w:w="3005" w:type="dxa"/>
+          </w:tcPr>
+          <w:p>
+            <w:pPr>
+              <w:rPr>
+                <w:sz w:val="24"/>
+                <w:szCs w:val="22"/>
+                <w:highlight w:val="yellow"/>
+                <w:lang w:val="en-US"/>
+              </w:rPr>
+            </w:pPr>
+            <w:r>
+              <w:rPr>
+                <w:sz w:val="24"/>
+                <w:szCs w:val="22"/>
+                <w:highlight w:val="yellow"/>
+                <w:lang w:val="en-US"/>
+              </w:rPr>
+              <w:t>Aniket123</w:t>
+            </w:r>
+          </w:p>
+        </w:tc>
+        <w:tc>
+          <w:tcPr>
+            <w:tcW w:w="3006" w:type="dxa"/>
+          </w:tcPr>
+          <w:p>
+            <w:pPr>
+              <w:rPr>
+                <w:sz w:val="24"/>
+                <w:szCs w:val="22"/>
+                <w:lang w:val="en-US"/>
+              </w:rPr>
+            </w:pPr>
+            <w:r>
+              <w:rPr>
+                <w:sz w:val="24"/>
+                <w:szCs w:val="22"/>
+                <w:highlight w:val="yellow"/>
+                <w:lang w:val="en-US"/>
+              </w:rPr>
+              <w:t>Not Run</w:t>
+            </w:r>
+            <w:bookmarkStart w:id="0" w:name="_GoBack"/>
+            <w:bookmarkEnd w:id="0"/>
+          </w:p>
+        </w:tc>
+      </w:tr>
+    </w:tbl>
+    <w:p>
+      <w:pPr>
+        <w:pStyle w:val="ListParagraph"/>
+        <w:numPr>
+          <w:ilvl w:val="0"/>
+          <w:numId w:val="4"/>
+        </w:numPr>
+        <w:rPr>
+          <w:sz w:val="24"/>
+          <w:szCs w:val="22"/>
+          <w:lang w:val="en-US"/>
+        </w:rPr>
+      </w:pPr>
     </w:p>
     <w:sectPr>
       <w:pgSz w:w="11906" w:h="16838"/>
@@ -6633,6 +7058,32 @@
       <w:u w:val="single"/>
     </w:rPr>
   </w:style>
+  <w:style w:type="table" w:styleId="TableGrid">
+    <w:name w:val="Table Grid"/>
+    <w:basedOn w:val="TableNormal"/>
+    <w:uiPriority w:val="39"/>
+    <w:rsid w:val="00922DD0"/>
+    <w:pPr>
+      <w:spacing w:after="0" w:line="240" w:lineRule="auto"/>
+    </w:pPr>
+    <w:tblPr>
+      <w:tblInd w:w="0" w:type="dxa"/>
+      <w:tblBorders>
+        <w:top w:val="single" w:sz="4" w:space="0" w:color="auto"/>
+        <w:left w:val="single" w:sz="4" w:space="0" w:color="auto"/>
+        <w:bottom w:val="single" w:sz="4" w:space="0" w:color="auto"/>
+        <w:right w:val="single" w:sz="4" w:space="0" w:color="auto"/>
+        <w:insideH w:val="single" w:sz="4" w:space="0" w:color="auto"/>
+        <w:insideV w:val="single" w:sz="4" w:space="0" w:color="auto"/>
+      </w:tblBorders>
+      <w:tblCellMar>
+        <w:top w:w="0" w:type="dxa"/>
+        <w:left w:w="108" w:type="dxa"/>
+        <w:bottom w:w="0" w:type="dxa"/>
+        <w:right w:w="108" w:type="dxa"/>
+      </w:tblCellMar>
+    </w:tblPr>
+  </w:style>
 </w:styles>
 </file>
 

</xml_diff>